<commit_message>
Shto modulin Oferta me dy lloje, email, krijo kontrate
</commit_message>
<xml_diff>
--- a/templates/PAKOT_FAMILJE_DHE_BIZNES_PREMIUM.docx
+++ b/templates/PAKOT_FAMILJE_DHE_BIZNES_PREMIUM.docx
@@ -13,26 +13,28 @@
     </w:p>
     <w:tbl>
       <w:tblPr>
-        <w:tblW w:w="6475" w:type="dxa"/>
+        <w:tblW w:w="10615" w:type="dxa"/>
+        <w:tblBorders>
+          <w:top w:val="single" w:sz="4" w:space="0" w:color="auto"/>
+          <w:left w:val="single" w:sz="4" w:space="0" w:color="auto"/>
+          <w:bottom w:val="single" w:sz="4" w:space="0" w:color="auto"/>
+          <w:right w:val="single" w:sz="4" w:space="0" w:color="auto"/>
+          <w:insideH w:val="single" w:sz="4" w:space="0" w:color="auto"/>
+          <w:insideV w:val="single" w:sz="4" w:space="0" w:color="auto"/>
+        </w:tblBorders>
         <w:tblLook w:val="04A0" w:firstRow="1" w:lastRow="0" w:firstColumn="1" w:lastColumn="0" w:noHBand="0" w:noVBand="1"/>
       </w:tblPr>
       <w:tblGrid>
         <w:gridCol w:w="4420"/>
-        <w:gridCol w:w="2055"/>
+        <w:gridCol w:w="6195"/>
       </w:tblGrid>
       <w:tr>
         <w:trPr>
-          <w:trHeight w:val="402"/>
+          <w:trHeight w:val="20"/>
         </w:trPr>
         <w:tc>
           <w:tcPr>
             <w:tcW w:w="4420" w:type="dxa"/>
-            <w:tcBorders>
-              <w:top w:val="single" w:sz="4" w:space="0" w:color="auto"/>
-              <w:left w:val="single" w:sz="4" w:space="0" w:color="auto"/>
-              <w:bottom w:val="single" w:sz="4" w:space="0" w:color="auto"/>
-              <w:right w:val="single" w:sz="4" w:space="0" w:color="auto"/>
-            </w:tcBorders>
             <w:shd w:val="clear" w:color="000000" w:fill="E3EBF8"/>
             <w:noWrap/>
             <w:vAlign w:val="center"/>
@@ -41,14 +43,14 @@
           <w:p>
             <w:pPr>
               <w:spacing w:after="0" w:line="240" w:lineRule="auto"/>
-              <w:ind w:firstLineChars="100" w:firstLine="161"/>
+              <w:ind w:firstLineChars="100" w:firstLine="201"/>
               <w:rPr>
                 <w:rFonts w:ascii="Montserrat" w:eastAsia="Times New Roman" w:hAnsi="Montserrat" w:cs="Calibri"/>
                 <w:b/>
                 <w:bCs/>
                 <w:color w:val="007EC5"/>
                 <w:kern w:val="0"/>
-                <w:sz w:val="16"/>
+                <w:sz w:val="20"/>
                 <w:szCs w:val="16"/>
                 <w14:ligatures w14:val="none"/>
               </w:rPr>
@@ -60,7 +62,7 @@
                 <w:bCs/>
                 <w:color w:val="007EC5"/>
                 <w:kern w:val="0"/>
-                <w:sz w:val="16"/>
+                <w:sz w:val="20"/>
                 <w:szCs w:val="16"/>
                 <w14:ligatures w14:val="none"/>
               </w:rPr>
@@ -70,13 +72,7 @@
         </w:tc>
         <w:tc>
           <w:tcPr>
-            <w:tcW w:w="2055" w:type="dxa"/>
-            <w:tcBorders>
-              <w:top w:val="single" w:sz="4" w:space="0" w:color="auto"/>
-              <w:left w:val="nil"/>
-              <w:bottom w:val="single" w:sz="4" w:space="0" w:color="auto"/>
-              <w:right w:val="single" w:sz="4" w:space="0" w:color="auto"/>
-            </w:tcBorders>
+            <w:tcW w:w="6195" w:type="dxa"/>
             <w:shd w:val="clear" w:color="000000" w:fill="E3EBF8"/>
             <w:noWrap/>
             <w:vAlign w:val="center"/>
@@ -92,13 +88,11 @@
                 <w:bCs/>
                 <w:color w:val="007EC5"/>
                 <w:kern w:val="0"/>
-                <w:sz w:val="16"/>
-                <w:szCs w:val="16"/>
-                <w14:ligatures w14:val="none"/>
-              </w:rPr>
-            </w:pPr>
-            <w:bookmarkStart w:id="1" w:name="_GoBack"/>
-            <w:bookmarkEnd w:id="1"/>
+                <w:sz w:val="20"/>
+                <w:szCs w:val="16"/>
+                <w14:ligatures w14:val="none"/>
+              </w:rPr>
+            </w:pPr>
             <w:r>
               <w:rPr>
                 <w:rFonts w:ascii="Montserrat" w:eastAsia="Times New Roman" w:hAnsi="Montserrat" w:cs="Calibri"/>
@@ -106,7 +100,7 @@
                 <w:bCs/>
                 <w:color w:val="007EC5"/>
                 <w:kern w:val="0"/>
-                <w:sz w:val="16"/>
+                <w:sz w:val="20"/>
                 <w:szCs w:val="16"/>
                 <w14:ligatures w14:val="none"/>
               </w:rPr>
@@ -117,17 +111,11 @@
       </w:tr>
       <w:tr>
         <w:trPr>
-          <w:trHeight w:val="510"/>
+          <w:trHeight w:val="20"/>
         </w:trPr>
         <w:tc>
           <w:tcPr>
             <w:tcW w:w="4420" w:type="dxa"/>
-            <w:tcBorders>
-              <w:top w:val="nil"/>
-              <w:left w:val="single" w:sz="4" w:space="0" w:color="auto"/>
-              <w:bottom w:val="single" w:sz="4" w:space="0" w:color="auto"/>
-              <w:right w:val="single" w:sz="4" w:space="0" w:color="auto"/>
-            </w:tcBorders>
             <w:noWrap/>
             <w:vAlign w:val="center"/>
             <w:hideMark/>
@@ -135,14 +123,14 @@
           <w:p>
             <w:pPr>
               <w:spacing w:after="0" w:line="240" w:lineRule="auto"/>
-              <w:ind w:firstLineChars="100" w:firstLine="161"/>
+              <w:ind w:firstLineChars="100" w:firstLine="201"/>
               <w:rPr>
                 <w:rFonts w:ascii="Montserrat" w:eastAsia="Times New Roman" w:hAnsi="Montserrat" w:cs="Calibri"/>
                 <w:b/>
                 <w:bCs/>
                 <w:color w:val="000000"/>
                 <w:kern w:val="0"/>
-                <w:sz w:val="16"/>
+                <w:sz w:val="20"/>
                 <w:szCs w:val="16"/>
                 <w14:ligatures w14:val="none"/>
               </w:rPr>
@@ -154,7 +142,7 @@
                 <w:bCs/>
                 <w:color w:val="000000"/>
                 <w:kern w:val="0"/>
-                <w:sz w:val="16"/>
+                <w:sz w:val="20"/>
                 <w:szCs w:val="16"/>
                 <w14:ligatures w14:val="none"/>
               </w:rPr>
@@ -164,13 +152,7 @@
         </w:tc>
         <w:tc>
           <w:tcPr>
-            <w:tcW w:w="2055" w:type="dxa"/>
-            <w:tcBorders>
-              <w:top w:val="single" w:sz="4" w:space="0" w:color="auto"/>
-              <w:left w:val="single" w:sz="4" w:space="0" w:color="auto"/>
-              <w:bottom w:val="single" w:sz="4" w:space="0" w:color="auto"/>
-              <w:right w:val="single" w:sz="4" w:space="0" w:color="auto"/>
-            </w:tcBorders>
+            <w:tcW w:w="6195" w:type="dxa"/>
             <w:noWrap/>
             <w:vAlign w:val="center"/>
             <w:hideMark/>
@@ -183,7 +165,7 @@
                 <w:rFonts w:ascii="Montserrat" w:eastAsia="Times New Roman" w:hAnsi="Montserrat" w:cs="Calibri"/>
                 <w:color w:val="000000"/>
                 <w:kern w:val="0"/>
-                <w:sz w:val="16"/>
+                <w:sz w:val="20"/>
                 <w:szCs w:val="16"/>
                 <w14:ligatures w14:val="none"/>
               </w:rPr>
@@ -192,7 +174,7 @@
               <w:rPr>
                 <w:rFonts w:ascii="Montserrat" w:hAnsi="Montserrat" w:cs="Calibri"/>
                 <w:color w:val="000000"/>
-                <w:sz w:val="16"/>
+                <w:sz w:val="20"/>
                 <w:szCs w:val="16"/>
               </w:rPr>
               <w:t xml:space="preserve">KS, ALB, </w:t>
@@ -202,7 +184,7 @@
                 <w:rFonts w:ascii="Montserrat" w:eastAsia="Times New Roman" w:hAnsi="Montserrat" w:cs="Calibri"/>
                 <w:color w:val="000000"/>
                 <w:kern w:val="0"/>
-                <w:sz w:val="16"/>
+                <w:sz w:val="20"/>
                 <w:szCs w:val="16"/>
                 <w14:ligatures w14:val="none"/>
               </w:rPr>
@@ -212,7 +194,7 @@
               <w:rPr>
                 <w:rFonts w:ascii="Montserrat" w:hAnsi="Montserrat" w:cs="Calibri"/>
                 <w:color w:val="000000"/>
-                <w:sz w:val="16"/>
+                <w:sz w:val="20"/>
                 <w:szCs w:val="16"/>
               </w:rPr>
               <w:t>, MNE, SRB, SLO, HR</w:t>
@@ -222,17 +204,11 @@
       </w:tr>
       <w:tr>
         <w:trPr>
-          <w:trHeight w:val="402"/>
+          <w:trHeight w:val="20"/>
         </w:trPr>
         <w:tc>
           <w:tcPr>
             <w:tcW w:w="4420" w:type="dxa"/>
-            <w:tcBorders>
-              <w:top w:val="nil"/>
-              <w:left w:val="single" w:sz="4" w:space="0" w:color="auto"/>
-              <w:bottom w:val="single" w:sz="4" w:space="0" w:color="auto"/>
-              <w:right w:val="single" w:sz="4" w:space="0" w:color="auto"/>
-            </w:tcBorders>
             <w:noWrap/>
             <w:vAlign w:val="center"/>
             <w:hideMark/>
@@ -240,14 +216,14 @@
           <w:p>
             <w:pPr>
               <w:spacing w:after="0" w:line="240" w:lineRule="auto"/>
-              <w:ind w:firstLineChars="100" w:firstLine="161"/>
+              <w:ind w:firstLineChars="100" w:firstLine="201"/>
               <w:rPr>
                 <w:rFonts w:ascii="Montserrat" w:eastAsia="Times New Roman" w:hAnsi="Montserrat" w:cs="Calibri"/>
                 <w:b/>
                 <w:bCs/>
                 <w:color w:val="000000"/>
                 <w:kern w:val="0"/>
-                <w:sz w:val="16"/>
+                <w:sz w:val="20"/>
                 <w:szCs w:val="16"/>
                 <w14:ligatures w14:val="none"/>
               </w:rPr>
@@ -259,7 +235,7 @@
                 <w:bCs/>
                 <w:color w:val="000000"/>
                 <w:kern w:val="0"/>
-                <w:sz w:val="16"/>
+                <w:sz w:val="20"/>
                 <w:szCs w:val="16"/>
                 <w14:ligatures w14:val="none"/>
               </w:rPr>
@@ -269,13 +245,7 @@
         </w:tc>
         <w:tc>
           <w:tcPr>
-            <w:tcW w:w="2055" w:type="dxa"/>
-            <w:tcBorders>
-              <w:top w:val="nil"/>
-              <w:left w:val="single" w:sz="4" w:space="0" w:color="auto"/>
-              <w:bottom w:val="single" w:sz="4" w:space="0" w:color="auto"/>
-              <w:right w:val="single" w:sz="4" w:space="0" w:color="auto"/>
-            </w:tcBorders>
+            <w:tcW w:w="6195" w:type="dxa"/>
             <w:noWrap/>
             <w:vAlign w:val="center"/>
             <w:hideMark/>
@@ -288,7 +258,7 @@
                 <w:rFonts w:ascii="Montserrat" w:eastAsia="Times New Roman" w:hAnsi="Montserrat" w:cs="Calibri"/>
                 <w:color w:val="000000"/>
                 <w:kern w:val="0"/>
-                <w:sz w:val="16"/>
+                <w:sz w:val="20"/>
                 <w:szCs w:val="16"/>
                 <w14:ligatures w14:val="none"/>
               </w:rPr>
@@ -297,7 +267,7 @@
               <w:rPr>
                 <w:rFonts w:ascii="Montserrat" w:hAnsi="Montserrat" w:cs="Calibri"/>
                 <w:color w:val="000000"/>
-                <w:sz w:val="16"/>
+                <w:sz w:val="20"/>
                 <w:szCs w:val="16"/>
               </w:rPr>
               <w:t>€ 70,000</w:t>
@@ -307,17 +277,11 @@
       </w:tr>
       <w:tr>
         <w:trPr>
-          <w:trHeight w:val="402"/>
+          <w:trHeight w:val="20"/>
         </w:trPr>
         <w:tc>
           <w:tcPr>
             <w:tcW w:w="4420" w:type="dxa"/>
-            <w:tcBorders>
-              <w:top w:val="nil"/>
-              <w:left w:val="single" w:sz="4" w:space="0" w:color="auto"/>
-              <w:bottom w:val="single" w:sz="4" w:space="0" w:color="auto"/>
-              <w:right w:val="nil"/>
-            </w:tcBorders>
             <w:shd w:val="clear" w:color="000000" w:fill="E3EBF8"/>
             <w:noWrap/>
             <w:vAlign w:val="center"/>
@@ -326,14 +290,14 @@
           <w:p>
             <w:pPr>
               <w:spacing w:after="0" w:line="240" w:lineRule="auto"/>
-              <w:ind w:firstLineChars="100" w:firstLine="161"/>
+              <w:ind w:firstLineChars="100" w:firstLine="201"/>
               <w:rPr>
                 <w:rFonts w:ascii="Montserrat" w:eastAsia="Times New Roman" w:hAnsi="Montserrat" w:cs="Calibri"/>
                 <w:b/>
                 <w:bCs/>
                 <w:color w:val="007EC5"/>
                 <w:kern w:val="0"/>
-                <w:sz w:val="16"/>
+                <w:sz w:val="20"/>
                 <w:szCs w:val="16"/>
                 <w14:ligatures w14:val="none"/>
               </w:rPr>
@@ -345,74 +309,560 @@
                 <w:bCs/>
                 <w:color w:val="007EC5"/>
                 <w:kern w:val="0"/>
-                <w:sz w:val="16"/>
-                <w:szCs w:val="16"/>
-                <w14:ligatures w14:val="none"/>
-              </w:rPr>
-              <w:t>Trajtimet Mjekësore Hospitalore</w:t>
-            </w:r>
-            <w:r>
+                <w:sz w:val="20"/>
+                <w:szCs w:val="16"/>
+                <w14:ligatures w14:val="none"/>
+              </w:rPr>
+              <w:t xml:space="preserve">Trajtimet Mjekësore Hospitalore </w:t>
+            </w:r>
+            <w:r>
+              <w:rPr>
+                <w:rFonts w:ascii="Montserrat" w:eastAsia="Times New Roman" w:hAnsi="Montserrat" w:cs="Calibri"/>
+                <w:color w:val="007EC5"/>
+                <w:kern w:val="0"/>
+                <w:sz w:val="20"/>
+                <w:szCs w:val="16"/>
+                <w14:ligatures w14:val="none"/>
+              </w:rPr>
+              <w:t>(dhomë gjysëmprivate)</w:t>
+            </w:r>
+          </w:p>
+        </w:tc>
+        <w:tc>
+          <w:tcPr>
+            <w:tcW w:w="6195" w:type="dxa"/>
+            <w:shd w:val="clear" w:color="000000" w:fill="E3EBF8"/>
+            <w:noWrap/>
+            <w:vAlign w:val="center"/>
+            <w:hideMark/>
+          </w:tcPr>
+          <w:p>
+            <w:pPr>
+              <w:spacing w:after="0" w:line="240" w:lineRule="auto"/>
               <w:rPr>
                 <w:rFonts w:ascii="Montserrat" w:eastAsia="Times New Roman" w:hAnsi="Montserrat" w:cs="Calibri"/>
                 <w:b/>
                 <w:bCs/>
                 <w:color w:val="007EC5"/>
                 <w:kern w:val="0"/>
-                <w:sz w:val="16"/>
-                <w:szCs w:val="16"/>
-                <w14:ligatures w14:val="none"/>
-              </w:rPr>
-              <w:t xml:space="preserve"> </w:t>
-            </w:r>
-            <w:r>
-              <w:rPr>
-                <w:rFonts w:ascii="Montserrat" w:eastAsia="Times New Roman" w:hAnsi="Montserrat" w:cs="Calibri"/>
-                <w:color w:val="007EC5"/>
-                <w:kern w:val="0"/>
-                <w:sz w:val="16"/>
-                <w:szCs w:val="16"/>
-                <w14:ligatures w14:val="none"/>
-              </w:rPr>
-              <w:t>(dhomë gjysëmprivate)</w:t>
-            </w:r>
-          </w:p>
-        </w:tc>
-        <w:tc>
-          <w:tcPr>
-            <w:tcW w:w="2055" w:type="dxa"/>
-            <w:tcBorders>
-              <w:top w:val="single" w:sz="4" w:space="0" w:color="auto"/>
-              <w:left w:val="nil"/>
-              <w:bottom w:val="single" w:sz="4" w:space="0" w:color="auto"/>
-              <w:right w:val="nil"/>
-            </w:tcBorders>
-            <w:shd w:val="clear" w:color="000000" w:fill="E3EBF8"/>
-            <w:noWrap/>
-            <w:vAlign w:val="center"/>
-            <w:hideMark/>
-          </w:tcPr>
-          <w:p>
-            <w:pPr>
-              <w:spacing w:after="0" w:line="240" w:lineRule="auto"/>
+                <w:sz w:val="20"/>
+                <w:szCs w:val="16"/>
+                <w14:ligatures w14:val="none"/>
+              </w:rPr>
+            </w:pPr>
+            <w:r>
               <w:rPr>
                 <w:rFonts w:ascii="Montserrat" w:eastAsia="Times New Roman" w:hAnsi="Montserrat" w:cs="Calibri"/>
                 <w:b/>
                 <w:bCs/>
                 <w:color w:val="007EC5"/>
                 <w:kern w:val="0"/>
-                <w:sz w:val="16"/>
-                <w:szCs w:val="16"/>
-                <w14:ligatures w14:val="none"/>
-              </w:rPr>
-            </w:pPr>
-            <w:r>
+                <w:sz w:val="20"/>
+                <w:szCs w:val="16"/>
+                <w14:ligatures w14:val="none"/>
+              </w:rPr>
+              <w:t> </w:t>
+            </w:r>
+          </w:p>
+        </w:tc>
+      </w:tr>
+      <w:tr>
+        <w:trPr>
+          <w:trHeight w:val="20"/>
+        </w:trPr>
+        <w:tc>
+          <w:tcPr>
+            <w:tcW w:w="4420" w:type="dxa"/>
+            <w:noWrap/>
+            <w:vAlign w:val="center"/>
+            <w:hideMark/>
+          </w:tcPr>
+          <w:p>
+            <w:pPr>
+              <w:spacing w:after="0" w:line="240" w:lineRule="auto"/>
+              <w:ind w:firstLineChars="100" w:firstLine="200"/>
+              <w:rPr>
+                <w:rFonts w:ascii="Montserrat" w:eastAsia="Times New Roman" w:hAnsi="Montserrat" w:cs="Calibri"/>
+                <w:color w:val="000000"/>
+                <w:kern w:val="0"/>
+                <w:sz w:val="20"/>
+                <w:szCs w:val="16"/>
+                <w14:ligatures w14:val="none"/>
+              </w:rPr>
+            </w:pPr>
+            <w:r>
+              <w:rPr>
+                <w:rFonts w:ascii="Montserrat" w:eastAsia="Times New Roman" w:hAnsi="Montserrat" w:cs="Calibri"/>
+                <w:color w:val="000000"/>
+                <w:kern w:val="0"/>
+                <w:sz w:val="20"/>
+                <w:szCs w:val="16"/>
+                <w14:ligatures w14:val="none"/>
+              </w:rPr>
+              <w:t>Shpenzimet për mjekun e përgjithshëm</w:t>
+            </w:r>
+          </w:p>
+        </w:tc>
+        <w:tc>
+          <w:tcPr>
+            <w:tcW w:w="6195" w:type="dxa"/>
+            <w:vMerge w:val="restart"/>
+            <w:noWrap/>
+            <w:vAlign w:val="center"/>
+            <w:hideMark/>
+          </w:tcPr>
+          <w:p>
+            <w:pPr>
+              <w:spacing w:after="0" w:line="240" w:lineRule="auto"/>
+              <w:jc w:val="center"/>
+              <w:rPr>
+                <w:rFonts w:ascii="Montserrat" w:eastAsia="Times New Roman" w:hAnsi="Montserrat" w:cs="Calibri"/>
+                <w:color w:val="000000"/>
+                <w:kern w:val="0"/>
+                <w:sz w:val="20"/>
+                <w:szCs w:val="16"/>
+                <w14:ligatures w14:val="none"/>
+              </w:rPr>
+            </w:pPr>
+            <w:r>
+              <w:rPr>
+                <w:rFonts w:ascii="Montserrat" w:eastAsia="Times New Roman" w:hAnsi="Montserrat" w:cs="Calibri"/>
+                <w:color w:val="000000"/>
+                <w:kern w:val="0"/>
+                <w:sz w:val="20"/>
+                <w:szCs w:val="16"/>
+                <w14:ligatures w14:val="none"/>
+              </w:rPr>
+              <w:t>100%</w:t>
+            </w:r>
+          </w:p>
+        </w:tc>
+      </w:tr>
+      <w:tr>
+        <w:trPr>
+          <w:trHeight w:val="20"/>
+        </w:trPr>
+        <w:tc>
+          <w:tcPr>
+            <w:tcW w:w="4420" w:type="dxa"/>
+            <w:noWrap/>
+            <w:vAlign w:val="center"/>
+            <w:hideMark/>
+          </w:tcPr>
+          <w:p>
+            <w:pPr>
+              <w:spacing w:after="0" w:line="240" w:lineRule="auto"/>
+              <w:ind w:firstLineChars="100" w:firstLine="200"/>
+              <w:rPr>
+                <w:rFonts w:ascii="Montserrat" w:eastAsia="Times New Roman" w:hAnsi="Montserrat" w:cs="Calibri"/>
+                <w:color w:val="000000"/>
+                <w:kern w:val="0"/>
+                <w:sz w:val="20"/>
+                <w:szCs w:val="16"/>
+                <w14:ligatures w14:val="none"/>
+              </w:rPr>
+            </w:pPr>
+            <w:r>
+              <w:rPr>
+                <w:rFonts w:ascii="Montserrat" w:eastAsia="Times New Roman" w:hAnsi="Montserrat" w:cs="Calibri"/>
+                <w:color w:val="000000"/>
+                <w:kern w:val="0"/>
+                <w:sz w:val="20"/>
+                <w:szCs w:val="16"/>
+                <w14:ligatures w14:val="none"/>
+              </w:rPr>
+              <w:t>Shpenzimet për mjekun specialist</w:t>
+            </w:r>
+          </w:p>
+        </w:tc>
+        <w:tc>
+          <w:tcPr>
+            <w:tcW w:w="6195" w:type="dxa"/>
+            <w:vMerge/>
+            <w:vAlign w:val="center"/>
+            <w:hideMark/>
+          </w:tcPr>
+          <w:p>
+            <w:pPr>
+              <w:spacing w:after="0" w:line="240" w:lineRule="auto"/>
+              <w:rPr>
+                <w:rFonts w:ascii="Montserrat" w:eastAsia="Times New Roman" w:hAnsi="Montserrat" w:cs="Calibri"/>
+                <w:color w:val="000000"/>
+                <w:kern w:val="0"/>
+                <w:sz w:val="20"/>
+                <w:szCs w:val="16"/>
+                <w14:ligatures w14:val="none"/>
+              </w:rPr>
+            </w:pPr>
+          </w:p>
+        </w:tc>
+      </w:tr>
+      <w:tr>
+        <w:trPr>
+          <w:trHeight w:val="20"/>
+        </w:trPr>
+        <w:tc>
+          <w:tcPr>
+            <w:tcW w:w="4420" w:type="dxa"/>
+            <w:noWrap/>
+            <w:vAlign w:val="center"/>
+            <w:hideMark/>
+          </w:tcPr>
+          <w:p>
+            <w:pPr>
+              <w:spacing w:after="0" w:line="240" w:lineRule="auto"/>
+              <w:ind w:firstLineChars="100" w:firstLine="200"/>
+              <w:rPr>
+                <w:rFonts w:ascii="Montserrat" w:eastAsia="Times New Roman" w:hAnsi="Montserrat" w:cs="Calibri"/>
+                <w:color w:val="000000"/>
+                <w:kern w:val="0"/>
+                <w:sz w:val="20"/>
+                <w:szCs w:val="16"/>
+                <w14:ligatures w14:val="none"/>
+              </w:rPr>
+            </w:pPr>
+            <w:r>
+              <w:rPr>
+                <w:rFonts w:ascii="Montserrat" w:eastAsia="Times New Roman" w:hAnsi="Montserrat" w:cs="Calibri"/>
+                <w:color w:val="000000"/>
+                <w:kern w:val="0"/>
+                <w:sz w:val="20"/>
+                <w:szCs w:val="16"/>
+                <w14:ligatures w14:val="none"/>
+              </w:rPr>
+              <w:t>Shpenzimet për operacion</w:t>
+            </w:r>
+          </w:p>
+        </w:tc>
+        <w:tc>
+          <w:tcPr>
+            <w:tcW w:w="6195" w:type="dxa"/>
+            <w:vMerge/>
+            <w:vAlign w:val="center"/>
+            <w:hideMark/>
+          </w:tcPr>
+          <w:p>
+            <w:pPr>
+              <w:spacing w:after="0" w:line="240" w:lineRule="auto"/>
+              <w:rPr>
+                <w:rFonts w:ascii="Montserrat" w:eastAsia="Times New Roman" w:hAnsi="Montserrat" w:cs="Calibri"/>
+                <w:color w:val="000000"/>
+                <w:kern w:val="0"/>
+                <w:sz w:val="20"/>
+                <w:szCs w:val="16"/>
+                <w14:ligatures w14:val="none"/>
+              </w:rPr>
+            </w:pPr>
+          </w:p>
+        </w:tc>
+      </w:tr>
+      <w:tr>
+        <w:trPr>
+          <w:trHeight w:val="20"/>
+        </w:trPr>
+        <w:tc>
+          <w:tcPr>
+            <w:tcW w:w="4420" w:type="dxa"/>
+            <w:noWrap/>
+            <w:vAlign w:val="center"/>
+            <w:hideMark/>
+          </w:tcPr>
+          <w:p>
+            <w:pPr>
+              <w:spacing w:after="0" w:line="240" w:lineRule="auto"/>
+              <w:ind w:firstLineChars="100" w:firstLine="200"/>
+              <w:rPr>
+                <w:rFonts w:ascii="Montserrat" w:eastAsia="Times New Roman" w:hAnsi="Montserrat" w:cs="Calibri"/>
+                <w:color w:val="000000"/>
+                <w:kern w:val="0"/>
+                <w:sz w:val="20"/>
+                <w:szCs w:val="16"/>
+                <w14:ligatures w14:val="none"/>
+              </w:rPr>
+            </w:pPr>
+            <w:r>
+              <w:rPr>
+                <w:rFonts w:ascii="Montserrat" w:eastAsia="Times New Roman" w:hAnsi="Montserrat" w:cs="Calibri"/>
+                <w:color w:val="000000"/>
+                <w:kern w:val="0"/>
+                <w:sz w:val="20"/>
+                <w:szCs w:val="16"/>
+                <w14:ligatures w14:val="none"/>
+              </w:rPr>
+              <w:t>Shpenzimet për kujdesin intenziv</w:t>
+            </w:r>
+          </w:p>
+        </w:tc>
+        <w:tc>
+          <w:tcPr>
+            <w:tcW w:w="6195" w:type="dxa"/>
+            <w:vMerge/>
+            <w:vAlign w:val="center"/>
+            <w:hideMark/>
+          </w:tcPr>
+          <w:p>
+            <w:pPr>
+              <w:spacing w:after="0" w:line="240" w:lineRule="auto"/>
+              <w:rPr>
+                <w:rFonts w:ascii="Montserrat" w:eastAsia="Times New Roman" w:hAnsi="Montserrat" w:cs="Calibri"/>
+                <w:color w:val="000000"/>
+                <w:kern w:val="0"/>
+                <w:sz w:val="20"/>
+                <w:szCs w:val="16"/>
+                <w14:ligatures w14:val="none"/>
+              </w:rPr>
+            </w:pPr>
+          </w:p>
+        </w:tc>
+      </w:tr>
+      <w:tr>
+        <w:trPr>
+          <w:trHeight w:val="20"/>
+        </w:trPr>
+        <w:tc>
+          <w:tcPr>
+            <w:tcW w:w="4420" w:type="dxa"/>
+            <w:vAlign w:val="center"/>
+            <w:hideMark/>
+          </w:tcPr>
+          <w:p>
+            <w:pPr>
+              <w:spacing w:after="0" w:line="240" w:lineRule="auto"/>
+              <w:ind w:firstLineChars="100" w:firstLine="200"/>
+              <w:rPr>
+                <w:rFonts w:ascii="Montserrat" w:eastAsia="Times New Roman" w:hAnsi="Montserrat" w:cs="Calibri"/>
+                <w:color w:val="000000"/>
+                <w:kern w:val="0"/>
+                <w:sz w:val="20"/>
+                <w:szCs w:val="14"/>
+                <w14:ligatures w14:val="none"/>
+              </w:rPr>
+            </w:pPr>
+            <w:r>
+              <w:rPr>
+                <w:rFonts w:ascii="Montserrat" w:eastAsia="Times New Roman" w:hAnsi="Montserrat" w:cs="Calibri"/>
+                <w:color w:val="000000"/>
+                <w:kern w:val="0"/>
+                <w:sz w:val="20"/>
+                <w:szCs w:val="14"/>
+                <w14:ligatures w14:val="none"/>
+              </w:rPr>
+              <w:t>Kontrolle diagnostifikuese, duke përfshirë ato patologjike, rreze X, skane CT, skane MRI, skane PET</w:t>
+            </w:r>
+          </w:p>
+        </w:tc>
+        <w:tc>
+          <w:tcPr>
+            <w:tcW w:w="6195" w:type="dxa"/>
+            <w:vMerge/>
+            <w:vAlign w:val="center"/>
+            <w:hideMark/>
+          </w:tcPr>
+          <w:p>
+            <w:pPr>
+              <w:spacing w:after="0" w:line="240" w:lineRule="auto"/>
+              <w:rPr>
+                <w:rFonts w:ascii="Montserrat" w:eastAsia="Times New Roman" w:hAnsi="Montserrat" w:cs="Calibri"/>
+                <w:color w:val="000000"/>
+                <w:kern w:val="0"/>
+                <w:sz w:val="20"/>
+                <w:szCs w:val="16"/>
+                <w14:ligatures w14:val="none"/>
+              </w:rPr>
+            </w:pPr>
+          </w:p>
+        </w:tc>
+      </w:tr>
+      <w:tr>
+        <w:trPr>
+          <w:trHeight w:val="20"/>
+        </w:trPr>
+        <w:tc>
+          <w:tcPr>
+            <w:tcW w:w="4420" w:type="dxa"/>
+            <w:noWrap/>
+            <w:vAlign w:val="center"/>
+            <w:hideMark/>
+          </w:tcPr>
+          <w:p>
+            <w:pPr>
+              <w:spacing w:after="0" w:line="240" w:lineRule="auto"/>
+              <w:ind w:firstLineChars="100" w:firstLine="200"/>
+              <w:rPr>
+                <w:rFonts w:ascii="Montserrat" w:eastAsia="Times New Roman" w:hAnsi="Montserrat" w:cs="Calibri"/>
+                <w:color w:val="000000"/>
+                <w:kern w:val="0"/>
+                <w:sz w:val="20"/>
+                <w:szCs w:val="16"/>
+                <w14:ligatures w14:val="none"/>
+              </w:rPr>
+            </w:pPr>
+            <w:r>
+              <w:rPr>
+                <w:rFonts w:ascii="Montserrat" w:eastAsia="Times New Roman" w:hAnsi="Montserrat" w:cs="Calibri"/>
+                <w:color w:val="000000"/>
+                <w:kern w:val="0"/>
+                <w:sz w:val="20"/>
+                <w:szCs w:val="16"/>
+                <w14:ligatures w14:val="none"/>
+              </w:rPr>
+              <w:t>Analizat laboratorike</w:t>
+            </w:r>
+          </w:p>
+        </w:tc>
+        <w:tc>
+          <w:tcPr>
+            <w:tcW w:w="6195" w:type="dxa"/>
+            <w:vMerge/>
+            <w:vAlign w:val="center"/>
+            <w:hideMark/>
+          </w:tcPr>
+          <w:p>
+            <w:pPr>
+              <w:spacing w:after="0" w:line="240" w:lineRule="auto"/>
+              <w:rPr>
+                <w:rFonts w:ascii="Montserrat" w:eastAsia="Times New Roman" w:hAnsi="Montserrat" w:cs="Calibri"/>
+                <w:color w:val="000000"/>
+                <w:kern w:val="0"/>
+                <w:sz w:val="20"/>
+                <w:szCs w:val="16"/>
+                <w14:ligatures w14:val="none"/>
+              </w:rPr>
+            </w:pPr>
+          </w:p>
+        </w:tc>
+      </w:tr>
+      <w:tr>
+        <w:trPr>
+          <w:trHeight w:val="20"/>
+        </w:trPr>
+        <w:tc>
+          <w:tcPr>
+            <w:tcW w:w="4420" w:type="dxa"/>
+            <w:noWrap/>
+            <w:vAlign w:val="center"/>
+            <w:hideMark/>
+          </w:tcPr>
+          <w:p>
+            <w:pPr>
+              <w:spacing w:after="0" w:line="240" w:lineRule="auto"/>
+              <w:ind w:firstLineChars="100" w:firstLine="200"/>
+              <w:rPr>
+                <w:rFonts w:ascii="Montserrat" w:eastAsia="Times New Roman" w:hAnsi="Montserrat" w:cs="Calibri"/>
+                <w:color w:val="000000"/>
+                <w:kern w:val="0"/>
+                <w:sz w:val="20"/>
+                <w:szCs w:val="16"/>
+                <w14:ligatures w14:val="none"/>
+              </w:rPr>
+            </w:pPr>
+            <w:r>
+              <w:rPr>
+                <w:rFonts w:ascii="Montserrat" w:eastAsia="Times New Roman" w:hAnsi="Montserrat" w:cs="Calibri"/>
+                <w:color w:val="000000"/>
+                <w:kern w:val="0"/>
+                <w:sz w:val="20"/>
+                <w:szCs w:val="16"/>
+                <w14:ligatures w14:val="none"/>
+              </w:rPr>
+              <w:t>Ilaçet e këshilluara nga mjeku</w:t>
+            </w:r>
+          </w:p>
+        </w:tc>
+        <w:tc>
+          <w:tcPr>
+            <w:tcW w:w="6195" w:type="dxa"/>
+            <w:vMerge/>
+            <w:vAlign w:val="center"/>
+            <w:hideMark/>
+          </w:tcPr>
+          <w:p>
+            <w:pPr>
+              <w:spacing w:after="0" w:line="240" w:lineRule="auto"/>
+              <w:rPr>
+                <w:rFonts w:ascii="Montserrat" w:eastAsia="Times New Roman" w:hAnsi="Montserrat" w:cs="Calibri"/>
+                <w:color w:val="000000"/>
+                <w:kern w:val="0"/>
+                <w:sz w:val="20"/>
+                <w:szCs w:val="16"/>
+                <w14:ligatures w14:val="none"/>
+              </w:rPr>
+            </w:pPr>
+          </w:p>
+        </w:tc>
+      </w:tr>
+      <w:tr>
+        <w:trPr>
+          <w:trHeight w:val="20"/>
+        </w:trPr>
+        <w:tc>
+          <w:tcPr>
+            <w:tcW w:w="4420" w:type="dxa"/>
+            <w:shd w:val="clear" w:color="000000" w:fill="E3EBF8"/>
+            <w:noWrap/>
+            <w:vAlign w:val="center"/>
+            <w:hideMark/>
+          </w:tcPr>
+          <w:p>
+            <w:pPr>
+              <w:spacing w:after="0" w:line="240" w:lineRule="auto"/>
+              <w:ind w:firstLineChars="100" w:firstLine="201"/>
               <w:rPr>
                 <w:rFonts w:ascii="Montserrat" w:eastAsia="Times New Roman" w:hAnsi="Montserrat" w:cs="Calibri"/>
                 <w:b/>
                 <w:bCs/>
                 <w:color w:val="007EC5"/>
                 <w:kern w:val="0"/>
-                <w:sz w:val="16"/>
+                <w:sz w:val="20"/>
+                <w:szCs w:val="16"/>
+                <w14:ligatures w14:val="none"/>
+              </w:rPr>
+            </w:pPr>
+            <w:r>
+              <w:rPr>
+                <w:rFonts w:ascii="Montserrat" w:eastAsia="Times New Roman" w:hAnsi="Montserrat" w:cs="Calibri"/>
+                <w:b/>
+                <w:bCs/>
+                <w:color w:val="007EC5"/>
+                <w:kern w:val="0"/>
+                <w:sz w:val="20"/>
+                <w:szCs w:val="16"/>
+                <w14:ligatures w14:val="none"/>
+              </w:rPr>
+              <w:t>Trajtimet Mjekësore Ambulantore</w:t>
+            </w:r>
+          </w:p>
+        </w:tc>
+        <w:tc>
+          <w:tcPr>
+            <w:tcW w:w="6195" w:type="dxa"/>
+            <w:shd w:val="clear" w:color="000000" w:fill="E3EBF8"/>
+            <w:noWrap/>
+            <w:vAlign w:val="center"/>
+            <w:hideMark/>
+          </w:tcPr>
+          <w:p>
+            <w:pPr>
+              <w:spacing w:after="0" w:line="240" w:lineRule="auto"/>
+              <w:rPr>
+                <w:rFonts w:ascii="Montserrat" w:eastAsia="Times New Roman" w:hAnsi="Montserrat" w:cs="Calibri"/>
+                <w:b/>
+                <w:bCs/>
+                <w:color w:val="007EC5"/>
+                <w:kern w:val="0"/>
+                <w:sz w:val="20"/>
+                <w:szCs w:val="16"/>
+                <w14:ligatures w14:val="none"/>
+              </w:rPr>
+            </w:pPr>
+            <w:r>
+              <w:rPr>
+                <w:rFonts w:ascii="Montserrat" w:eastAsia="Times New Roman" w:hAnsi="Montserrat" w:cs="Calibri"/>
+                <w:b/>
+                <w:bCs/>
+                <w:color w:val="007EC5"/>
+                <w:kern w:val="0"/>
+                <w:sz w:val="20"/>
                 <w:szCs w:val="16"/>
                 <w14:ligatures w14:val="none"/>
               </w:rPr>
@@ -423,17 +873,11 @@
       </w:tr>
       <w:tr>
         <w:trPr>
-          <w:trHeight w:val="360"/>
+          <w:trHeight w:val="20"/>
         </w:trPr>
         <w:tc>
           <w:tcPr>
             <w:tcW w:w="4420" w:type="dxa"/>
-            <w:tcBorders>
-              <w:top w:val="nil"/>
-              <w:left w:val="single" w:sz="4" w:space="0" w:color="auto"/>
-              <w:bottom w:val="single" w:sz="4" w:space="0" w:color="auto"/>
-              <w:right w:val="single" w:sz="4" w:space="0" w:color="auto"/>
-            </w:tcBorders>
             <w:noWrap/>
             <w:vAlign w:val="center"/>
             <w:hideMark/>
@@ -441,22 +885,22 @@
           <w:p>
             <w:pPr>
               <w:spacing w:after="0" w:line="240" w:lineRule="auto"/>
-              <w:ind w:firstLineChars="100" w:firstLine="160"/>
-              <w:rPr>
-                <w:rFonts w:ascii="Montserrat" w:eastAsia="Times New Roman" w:hAnsi="Montserrat" w:cs="Calibri"/>
-                <w:color w:val="000000"/>
-                <w:kern w:val="0"/>
-                <w:sz w:val="16"/>
-                <w:szCs w:val="16"/>
-                <w14:ligatures w14:val="none"/>
-              </w:rPr>
-            </w:pPr>
-            <w:r>
-              <w:rPr>
-                <w:rFonts w:ascii="Montserrat" w:eastAsia="Times New Roman" w:hAnsi="Montserrat" w:cs="Calibri"/>
-                <w:color w:val="000000"/>
-                <w:kern w:val="0"/>
-                <w:sz w:val="16"/>
+              <w:ind w:firstLineChars="100" w:firstLine="200"/>
+              <w:rPr>
+                <w:rFonts w:ascii="Montserrat" w:eastAsia="Times New Roman" w:hAnsi="Montserrat" w:cs="Calibri"/>
+                <w:color w:val="000000"/>
+                <w:kern w:val="0"/>
+                <w:sz w:val="20"/>
+                <w:szCs w:val="16"/>
+                <w14:ligatures w14:val="none"/>
+              </w:rPr>
+            </w:pPr>
+            <w:r>
+              <w:rPr>
+                <w:rFonts w:ascii="Montserrat" w:eastAsia="Times New Roman" w:hAnsi="Montserrat" w:cs="Calibri"/>
+                <w:color w:val="000000"/>
+                <w:kern w:val="0"/>
+                <w:sz w:val="20"/>
                 <w:szCs w:val="16"/>
                 <w14:ligatures w14:val="none"/>
               </w:rPr>
@@ -466,15 +910,8 @@
         </w:tc>
         <w:tc>
           <w:tcPr>
-            <w:tcW w:w="2055" w:type="dxa"/>
+            <w:tcW w:w="6195" w:type="dxa"/>
             <w:vMerge w:val="restart"/>
-            <w:tcBorders>
-              <w:top w:val="nil"/>
-              <w:left w:val="single" w:sz="4" w:space="0" w:color="auto"/>
-              <w:bottom w:val="single" w:sz="4" w:space="0" w:color="auto"/>
-              <w:right w:val="single" w:sz="4" w:space="0" w:color="auto"/>
-            </w:tcBorders>
-            <w:noWrap/>
             <w:vAlign w:val="center"/>
             <w:hideMark/>
           </w:tcPr>
@@ -486,38 +923,32 @@
                 <w:rFonts w:ascii="Montserrat" w:eastAsia="Times New Roman" w:hAnsi="Montserrat" w:cs="Calibri"/>
                 <w:color w:val="000000"/>
                 <w:kern w:val="0"/>
-                <w:sz w:val="16"/>
-                <w:szCs w:val="16"/>
-                <w14:ligatures w14:val="none"/>
-              </w:rPr>
-            </w:pPr>
-            <w:r>
-              <w:rPr>
-                <w:rFonts w:ascii="Montserrat" w:eastAsia="Times New Roman" w:hAnsi="Montserrat" w:cs="Calibri"/>
-                <w:color w:val="000000"/>
-                <w:kern w:val="0"/>
-                <w:sz w:val="16"/>
-                <w:szCs w:val="16"/>
-                <w14:ligatures w14:val="none"/>
-              </w:rPr>
-              <w:t>100%</w:t>
+                <w:sz w:val="20"/>
+                <w:szCs w:val="16"/>
+                <w14:ligatures w14:val="none"/>
+              </w:rPr>
+            </w:pPr>
+            <w:r>
+              <w:rPr>
+                <w:rFonts w:ascii="Montserrat" w:eastAsia="Times New Roman" w:hAnsi="Montserrat" w:cs="Calibri"/>
+                <w:color w:val="000000"/>
+                <w:kern w:val="0"/>
+                <w:sz w:val="20"/>
+                <w:szCs w:val="16"/>
+                <w14:ligatures w14:val="none"/>
+              </w:rPr>
+              <w:t>80%</w:t>
             </w:r>
           </w:p>
         </w:tc>
       </w:tr>
       <w:tr>
         <w:trPr>
-          <w:trHeight w:val="360"/>
+          <w:trHeight w:val="20"/>
         </w:trPr>
         <w:tc>
           <w:tcPr>
             <w:tcW w:w="4420" w:type="dxa"/>
-            <w:tcBorders>
-              <w:top w:val="nil"/>
-              <w:left w:val="single" w:sz="4" w:space="0" w:color="auto"/>
-              <w:bottom w:val="single" w:sz="4" w:space="0" w:color="auto"/>
-              <w:right w:val="single" w:sz="4" w:space="0" w:color="auto"/>
-            </w:tcBorders>
             <w:noWrap/>
             <w:vAlign w:val="center"/>
             <w:hideMark/>
@@ -525,22 +956,22 @@
           <w:p>
             <w:pPr>
               <w:spacing w:after="0" w:line="240" w:lineRule="auto"/>
-              <w:ind w:firstLineChars="100" w:firstLine="160"/>
-              <w:rPr>
-                <w:rFonts w:ascii="Montserrat" w:eastAsia="Times New Roman" w:hAnsi="Montserrat" w:cs="Calibri"/>
-                <w:color w:val="000000"/>
-                <w:kern w:val="0"/>
-                <w:sz w:val="16"/>
-                <w:szCs w:val="16"/>
-                <w14:ligatures w14:val="none"/>
-              </w:rPr>
-            </w:pPr>
-            <w:r>
-              <w:rPr>
-                <w:rFonts w:ascii="Montserrat" w:eastAsia="Times New Roman" w:hAnsi="Montserrat" w:cs="Calibri"/>
-                <w:color w:val="000000"/>
-                <w:kern w:val="0"/>
-                <w:sz w:val="16"/>
+              <w:ind w:firstLineChars="100" w:firstLine="200"/>
+              <w:rPr>
+                <w:rFonts w:ascii="Montserrat" w:eastAsia="Times New Roman" w:hAnsi="Montserrat" w:cs="Calibri"/>
+                <w:color w:val="000000"/>
+                <w:kern w:val="0"/>
+                <w:sz w:val="20"/>
+                <w:szCs w:val="16"/>
+                <w14:ligatures w14:val="none"/>
+              </w:rPr>
+            </w:pPr>
+            <w:r>
+              <w:rPr>
+                <w:rFonts w:ascii="Montserrat" w:eastAsia="Times New Roman" w:hAnsi="Montserrat" w:cs="Calibri"/>
+                <w:color w:val="000000"/>
+                <w:kern w:val="0"/>
+                <w:sz w:val="20"/>
                 <w:szCs w:val="16"/>
                 <w14:ligatures w14:val="none"/>
               </w:rPr>
@@ -550,25 +981,19 @@
         </w:tc>
         <w:tc>
           <w:tcPr>
-            <w:tcW w:w="2055" w:type="dxa"/>
+            <w:tcW w:w="6195" w:type="dxa"/>
             <w:vMerge/>
-            <w:tcBorders>
-              <w:top w:val="nil"/>
-              <w:left w:val="single" w:sz="4" w:space="0" w:color="auto"/>
-              <w:bottom w:val="single" w:sz="4" w:space="0" w:color="auto"/>
-              <w:right w:val="single" w:sz="4" w:space="0" w:color="auto"/>
-            </w:tcBorders>
-            <w:vAlign w:val="center"/>
-            <w:hideMark/>
-          </w:tcPr>
-          <w:p>
-            <w:pPr>
-              <w:spacing w:after="0" w:line="240" w:lineRule="auto"/>
-              <w:rPr>
-                <w:rFonts w:ascii="Montserrat" w:eastAsia="Times New Roman" w:hAnsi="Montserrat" w:cs="Calibri"/>
-                <w:color w:val="000000"/>
-                <w:kern w:val="0"/>
-                <w:sz w:val="16"/>
+            <w:vAlign w:val="center"/>
+            <w:hideMark/>
+          </w:tcPr>
+          <w:p>
+            <w:pPr>
+              <w:spacing w:after="0" w:line="240" w:lineRule="auto"/>
+              <w:rPr>
+                <w:rFonts w:ascii="Montserrat" w:eastAsia="Times New Roman" w:hAnsi="Montserrat" w:cs="Calibri"/>
+                <w:color w:val="000000"/>
+                <w:kern w:val="0"/>
+                <w:sz w:val="20"/>
                 <w:szCs w:val="16"/>
                 <w14:ligatures w14:val="none"/>
               </w:rPr>
@@ -578,17 +1003,11 @@
       </w:tr>
       <w:tr>
         <w:trPr>
-          <w:trHeight w:val="360"/>
+          <w:trHeight w:val="20"/>
         </w:trPr>
         <w:tc>
           <w:tcPr>
             <w:tcW w:w="4420" w:type="dxa"/>
-            <w:tcBorders>
-              <w:top w:val="nil"/>
-              <w:left w:val="single" w:sz="4" w:space="0" w:color="auto"/>
-              <w:bottom w:val="single" w:sz="4" w:space="0" w:color="auto"/>
-              <w:right w:val="single" w:sz="4" w:space="0" w:color="auto"/>
-            </w:tcBorders>
             <w:noWrap/>
             <w:vAlign w:val="center"/>
             <w:hideMark/>
@@ -596,50 +1015,44 @@
           <w:p>
             <w:pPr>
               <w:spacing w:after="0" w:line="240" w:lineRule="auto"/>
-              <w:ind w:firstLineChars="100" w:firstLine="160"/>
-              <w:rPr>
-                <w:rFonts w:ascii="Montserrat" w:eastAsia="Times New Roman" w:hAnsi="Montserrat" w:cs="Calibri"/>
-                <w:color w:val="000000"/>
-                <w:kern w:val="0"/>
-                <w:sz w:val="16"/>
-                <w:szCs w:val="16"/>
-                <w14:ligatures w14:val="none"/>
-              </w:rPr>
-            </w:pPr>
-            <w:r>
-              <w:rPr>
-                <w:rFonts w:ascii="Montserrat" w:eastAsia="Times New Roman" w:hAnsi="Montserrat" w:cs="Calibri"/>
-                <w:color w:val="000000"/>
-                <w:kern w:val="0"/>
-                <w:sz w:val="16"/>
-                <w:szCs w:val="16"/>
-                <w14:ligatures w14:val="none"/>
-              </w:rPr>
-              <w:t>Shpenzimet për operacion</w:t>
-            </w:r>
-          </w:p>
-        </w:tc>
-        <w:tc>
-          <w:tcPr>
-            <w:tcW w:w="2055" w:type="dxa"/>
+              <w:ind w:firstLineChars="100" w:firstLine="200"/>
+              <w:rPr>
+                <w:rFonts w:ascii="Montserrat" w:eastAsia="Times New Roman" w:hAnsi="Montserrat" w:cs="Calibri"/>
+                <w:color w:val="000000"/>
+                <w:kern w:val="0"/>
+                <w:sz w:val="20"/>
+                <w:szCs w:val="16"/>
+                <w14:ligatures w14:val="none"/>
+              </w:rPr>
+            </w:pPr>
+            <w:r>
+              <w:rPr>
+                <w:rFonts w:ascii="Montserrat" w:eastAsia="Times New Roman" w:hAnsi="Montserrat" w:cs="Calibri"/>
+                <w:color w:val="000000"/>
+                <w:kern w:val="0"/>
+                <w:sz w:val="20"/>
+                <w:szCs w:val="16"/>
+                <w14:ligatures w14:val="none"/>
+              </w:rPr>
+              <w:t>Kirurgjia ditore</w:t>
+            </w:r>
+          </w:p>
+        </w:tc>
+        <w:tc>
+          <w:tcPr>
+            <w:tcW w:w="6195" w:type="dxa"/>
             <w:vMerge/>
-            <w:tcBorders>
-              <w:top w:val="nil"/>
-              <w:left w:val="single" w:sz="4" w:space="0" w:color="auto"/>
-              <w:bottom w:val="single" w:sz="4" w:space="0" w:color="auto"/>
-              <w:right w:val="single" w:sz="4" w:space="0" w:color="auto"/>
-            </w:tcBorders>
-            <w:vAlign w:val="center"/>
-            <w:hideMark/>
-          </w:tcPr>
-          <w:p>
-            <w:pPr>
-              <w:spacing w:after="0" w:line="240" w:lineRule="auto"/>
-              <w:rPr>
-                <w:rFonts w:ascii="Montserrat" w:eastAsia="Times New Roman" w:hAnsi="Montserrat" w:cs="Calibri"/>
-                <w:color w:val="000000"/>
-                <w:kern w:val="0"/>
-                <w:sz w:val="16"/>
+            <w:vAlign w:val="center"/>
+            <w:hideMark/>
+          </w:tcPr>
+          <w:p>
+            <w:pPr>
+              <w:spacing w:after="0" w:line="240" w:lineRule="auto"/>
+              <w:rPr>
+                <w:rFonts w:ascii="Montserrat" w:eastAsia="Times New Roman" w:hAnsi="Montserrat" w:cs="Calibri"/>
+                <w:color w:val="000000"/>
+                <w:kern w:val="0"/>
+                <w:sz w:val="20"/>
                 <w:szCs w:val="16"/>
                 <w14:ligatures w14:val="none"/>
               </w:rPr>
@@ -649,68 +1062,55 @@
       </w:tr>
       <w:tr>
         <w:trPr>
-          <w:trHeight w:val="360"/>
+          <w:trHeight w:val="20"/>
         </w:trPr>
         <w:tc>
           <w:tcPr>
             <w:tcW w:w="4420" w:type="dxa"/>
-            <w:tcBorders>
-              <w:top w:val="nil"/>
-              <w:left w:val="single" w:sz="4" w:space="0" w:color="auto"/>
-              <w:bottom w:val="single" w:sz="4" w:space="0" w:color="auto"/>
-              <w:right w:val="single" w:sz="4" w:space="0" w:color="auto"/>
-            </w:tcBorders>
-            <w:noWrap/>
-            <w:vAlign w:val="center"/>
-            <w:hideMark/>
-          </w:tcPr>
-          <w:p>
-            <w:pPr>
-              <w:spacing w:after="0" w:line="240" w:lineRule="auto"/>
-              <w:ind w:firstLineChars="100" w:firstLine="160"/>
-              <w:rPr>
-                <w:rFonts w:ascii="Montserrat" w:eastAsia="Times New Roman" w:hAnsi="Montserrat" w:cs="Calibri"/>
-                <w:color w:val="000000"/>
-                <w:kern w:val="0"/>
-                <w:sz w:val="16"/>
-                <w:szCs w:val="16"/>
-                <w14:ligatures w14:val="none"/>
-              </w:rPr>
-            </w:pPr>
-            <w:r>
-              <w:rPr>
-                <w:rFonts w:ascii="Montserrat" w:eastAsia="Times New Roman" w:hAnsi="Montserrat" w:cs="Calibri"/>
-                <w:color w:val="000000"/>
-                <w:kern w:val="0"/>
-                <w:sz w:val="16"/>
-                <w:szCs w:val="16"/>
-                <w14:ligatures w14:val="none"/>
-              </w:rPr>
-              <w:t>Shpenzimet për kujdesin intenziv</w:t>
-            </w:r>
-          </w:p>
-        </w:tc>
-        <w:tc>
-          <w:tcPr>
-            <w:tcW w:w="2055" w:type="dxa"/>
+            <w:vAlign w:val="center"/>
+            <w:hideMark/>
+          </w:tcPr>
+          <w:p>
+            <w:pPr>
+              <w:spacing w:after="0" w:line="240" w:lineRule="auto"/>
+              <w:ind w:firstLineChars="100" w:firstLine="200"/>
+              <w:rPr>
+                <w:rFonts w:ascii="Montserrat" w:eastAsia="Times New Roman" w:hAnsi="Montserrat" w:cs="Calibri"/>
+                <w:color w:val="000000"/>
+                <w:kern w:val="0"/>
+                <w:sz w:val="20"/>
+                <w:szCs w:val="14"/>
+                <w14:ligatures w14:val="none"/>
+              </w:rPr>
+            </w:pPr>
+            <w:r>
+              <w:rPr>
+                <w:rFonts w:ascii="Montserrat" w:eastAsia="Times New Roman" w:hAnsi="Montserrat" w:cs="Calibri"/>
+                <w:color w:val="000000"/>
+                <w:kern w:val="0"/>
+                <w:sz w:val="20"/>
+                <w:szCs w:val="14"/>
+                <w14:ligatures w14:val="none"/>
+              </w:rPr>
+              <w:t>Kontrolle diagnostifikuese, duke përfshirë ato patologjike,    rreze X, skane CT, skane MRI, skane PET</w:t>
+            </w:r>
+          </w:p>
+        </w:tc>
+        <w:tc>
+          <w:tcPr>
+            <w:tcW w:w="6195" w:type="dxa"/>
             <w:vMerge/>
-            <w:tcBorders>
-              <w:top w:val="nil"/>
-              <w:left w:val="single" w:sz="4" w:space="0" w:color="auto"/>
-              <w:bottom w:val="single" w:sz="4" w:space="0" w:color="auto"/>
-              <w:right w:val="single" w:sz="4" w:space="0" w:color="auto"/>
-            </w:tcBorders>
-            <w:vAlign w:val="center"/>
-            <w:hideMark/>
-          </w:tcPr>
-          <w:p>
-            <w:pPr>
-              <w:spacing w:after="0" w:line="240" w:lineRule="auto"/>
-              <w:rPr>
-                <w:rFonts w:ascii="Montserrat" w:eastAsia="Times New Roman" w:hAnsi="Montserrat" w:cs="Calibri"/>
-                <w:color w:val="000000"/>
-                <w:kern w:val="0"/>
-                <w:sz w:val="16"/>
+            <w:vAlign w:val="center"/>
+            <w:hideMark/>
+          </w:tcPr>
+          <w:p>
+            <w:pPr>
+              <w:spacing w:after="0" w:line="240" w:lineRule="auto"/>
+              <w:rPr>
+                <w:rFonts w:ascii="Montserrat" w:eastAsia="Times New Roman" w:hAnsi="Montserrat" w:cs="Calibri"/>
+                <w:color w:val="000000"/>
+                <w:kern w:val="0"/>
+                <w:sz w:val="20"/>
                 <w:szCs w:val="16"/>
                 <w14:ligatures w14:val="none"/>
               </w:rPr>
@@ -720,67 +1120,56 @@
       </w:tr>
       <w:tr>
         <w:trPr>
-          <w:trHeight w:val="360"/>
+          <w:trHeight w:val="20"/>
         </w:trPr>
         <w:tc>
           <w:tcPr>
             <w:tcW w:w="4420" w:type="dxa"/>
-            <w:tcBorders>
-              <w:top w:val="nil"/>
-              <w:left w:val="single" w:sz="4" w:space="0" w:color="auto"/>
-              <w:bottom w:val="single" w:sz="4" w:space="0" w:color="auto"/>
-              <w:right w:val="single" w:sz="4" w:space="0" w:color="auto"/>
-            </w:tcBorders>
-            <w:vAlign w:val="center"/>
-            <w:hideMark/>
-          </w:tcPr>
-          <w:p>
-            <w:pPr>
-              <w:spacing w:after="0" w:line="240" w:lineRule="auto"/>
-              <w:ind w:firstLineChars="100" w:firstLine="140"/>
-              <w:rPr>
-                <w:rFonts w:ascii="Montserrat" w:eastAsia="Times New Roman" w:hAnsi="Montserrat" w:cs="Calibri"/>
-                <w:color w:val="000000"/>
-                <w:kern w:val="0"/>
-                <w:sz w:val="14"/>
-                <w:szCs w:val="14"/>
-                <w14:ligatures w14:val="none"/>
-              </w:rPr>
-            </w:pPr>
-            <w:r>
-              <w:rPr>
-                <w:rFonts w:ascii="Montserrat" w:eastAsia="Times New Roman" w:hAnsi="Montserrat" w:cs="Calibri"/>
-                <w:color w:val="000000"/>
-                <w:kern w:val="0"/>
-                <w:sz w:val="14"/>
-                <w:szCs w:val="14"/>
-                <w14:ligatures w14:val="none"/>
-              </w:rPr>
-              <w:t>Kontrolle diagnostifikuese, duke përfshirë ato patologjike, rreze X, skane CT, skane MRI, skane PET</w:t>
-            </w:r>
-          </w:p>
-        </w:tc>
-        <w:tc>
-          <w:tcPr>
-            <w:tcW w:w="2055" w:type="dxa"/>
+            <w:noWrap/>
+            <w:vAlign w:val="center"/>
+            <w:hideMark/>
+          </w:tcPr>
+          <w:p>
+            <w:pPr>
+              <w:spacing w:after="0" w:line="240" w:lineRule="auto"/>
+              <w:ind w:firstLineChars="100" w:firstLine="200"/>
+              <w:rPr>
+                <w:rFonts w:ascii="Montserrat" w:eastAsia="Times New Roman" w:hAnsi="Montserrat" w:cs="Calibri"/>
+                <w:color w:val="000000"/>
+                <w:kern w:val="0"/>
+                <w:sz w:val="20"/>
+                <w:szCs w:val="16"/>
+                <w14:ligatures w14:val="none"/>
+              </w:rPr>
+            </w:pPr>
+            <w:r>
+              <w:rPr>
+                <w:rFonts w:ascii="Montserrat" w:eastAsia="Times New Roman" w:hAnsi="Montserrat" w:cs="Calibri"/>
+                <w:color w:val="000000"/>
+                <w:kern w:val="0"/>
+                <w:sz w:val="20"/>
+                <w:szCs w:val="16"/>
+                <w14:ligatures w14:val="none"/>
+              </w:rPr>
+              <w:t>Analizat laboratorike</w:t>
+            </w:r>
+          </w:p>
+        </w:tc>
+        <w:tc>
+          <w:tcPr>
+            <w:tcW w:w="6195" w:type="dxa"/>
             <w:vMerge/>
-            <w:tcBorders>
-              <w:top w:val="nil"/>
-              <w:left w:val="single" w:sz="4" w:space="0" w:color="auto"/>
-              <w:bottom w:val="single" w:sz="4" w:space="0" w:color="auto"/>
-              <w:right w:val="single" w:sz="4" w:space="0" w:color="auto"/>
-            </w:tcBorders>
-            <w:vAlign w:val="center"/>
-            <w:hideMark/>
-          </w:tcPr>
-          <w:p>
-            <w:pPr>
-              <w:spacing w:after="0" w:line="240" w:lineRule="auto"/>
-              <w:rPr>
-                <w:rFonts w:ascii="Montserrat" w:eastAsia="Times New Roman" w:hAnsi="Montserrat" w:cs="Calibri"/>
-                <w:color w:val="000000"/>
-                <w:kern w:val="0"/>
-                <w:sz w:val="16"/>
+            <w:vAlign w:val="center"/>
+            <w:hideMark/>
+          </w:tcPr>
+          <w:p>
+            <w:pPr>
+              <w:spacing w:after="0" w:line="240" w:lineRule="auto"/>
+              <w:rPr>
+                <w:rFonts w:ascii="Montserrat" w:eastAsia="Times New Roman" w:hAnsi="Montserrat" w:cs="Calibri"/>
+                <w:color w:val="000000"/>
+                <w:kern w:val="0"/>
+                <w:sz w:val="20"/>
                 <w:szCs w:val="16"/>
                 <w14:ligatures w14:val="none"/>
               </w:rPr>
@@ -790,17 +1179,11 @@
       </w:tr>
       <w:tr>
         <w:trPr>
-          <w:trHeight w:val="360"/>
+          <w:trHeight w:val="20"/>
         </w:trPr>
         <w:tc>
           <w:tcPr>
             <w:tcW w:w="4420" w:type="dxa"/>
-            <w:tcBorders>
-              <w:top w:val="nil"/>
-              <w:left w:val="single" w:sz="4" w:space="0" w:color="auto"/>
-              <w:bottom w:val="single" w:sz="4" w:space="0" w:color="auto"/>
-              <w:right w:val="single" w:sz="4" w:space="0" w:color="auto"/>
-            </w:tcBorders>
             <w:noWrap/>
             <w:vAlign w:val="center"/>
             <w:hideMark/>
@@ -808,50 +1191,44 @@
           <w:p>
             <w:pPr>
               <w:spacing w:after="0" w:line="240" w:lineRule="auto"/>
-              <w:ind w:firstLineChars="100" w:firstLine="160"/>
-              <w:rPr>
-                <w:rFonts w:ascii="Montserrat" w:eastAsia="Times New Roman" w:hAnsi="Montserrat" w:cs="Calibri"/>
-                <w:color w:val="000000"/>
-                <w:kern w:val="0"/>
-                <w:sz w:val="16"/>
-                <w:szCs w:val="16"/>
-                <w14:ligatures w14:val="none"/>
-              </w:rPr>
-            </w:pPr>
-            <w:r>
-              <w:rPr>
-                <w:rFonts w:ascii="Montserrat" w:eastAsia="Times New Roman" w:hAnsi="Montserrat" w:cs="Calibri"/>
-                <w:color w:val="000000"/>
-                <w:kern w:val="0"/>
-                <w:sz w:val="16"/>
-                <w:szCs w:val="16"/>
-                <w14:ligatures w14:val="none"/>
-              </w:rPr>
-              <w:t>Analizat laboratorike</w:t>
-            </w:r>
-          </w:p>
-        </w:tc>
-        <w:tc>
-          <w:tcPr>
-            <w:tcW w:w="2055" w:type="dxa"/>
+              <w:ind w:firstLineChars="100" w:firstLine="200"/>
+              <w:rPr>
+                <w:rFonts w:ascii="Montserrat" w:eastAsia="Times New Roman" w:hAnsi="Montserrat" w:cs="Calibri"/>
+                <w:color w:val="000000"/>
+                <w:kern w:val="0"/>
+                <w:sz w:val="20"/>
+                <w:szCs w:val="16"/>
+                <w14:ligatures w14:val="none"/>
+              </w:rPr>
+            </w:pPr>
+            <w:r>
+              <w:rPr>
+                <w:rFonts w:ascii="Montserrat" w:eastAsia="Times New Roman" w:hAnsi="Montserrat" w:cs="Calibri"/>
+                <w:color w:val="000000"/>
+                <w:kern w:val="0"/>
+                <w:sz w:val="20"/>
+                <w:szCs w:val="16"/>
+                <w14:ligatures w14:val="none"/>
+              </w:rPr>
+              <w:t>Ilaçet e këshilluara nga mjeku</w:t>
+            </w:r>
+          </w:p>
+        </w:tc>
+        <w:tc>
+          <w:tcPr>
+            <w:tcW w:w="6195" w:type="dxa"/>
             <w:vMerge/>
-            <w:tcBorders>
-              <w:top w:val="nil"/>
-              <w:left w:val="single" w:sz="4" w:space="0" w:color="auto"/>
-              <w:bottom w:val="single" w:sz="4" w:space="0" w:color="auto"/>
-              <w:right w:val="single" w:sz="4" w:space="0" w:color="auto"/>
-            </w:tcBorders>
-            <w:vAlign w:val="center"/>
-            <w:hideMark/>
-          </w:tcPr>
-          <w:p>
-            <w:pPr>
-              <w:spacing w:after="0" w:line="240" w:lineRule="auto"/>
-              <w:rPr>
-                <w:rFonts w:ascii="Montserrat" w:eastAsia="Times New Roman" w:hAnsi="Montserrat" w:cs="Calibri"/>
-                <w:color w:val="000000"/>
-                <w:kern w:val="0"/>
-                <w:sz w:val="16"/>
+            <w:vAlign w:val="center"/>
+            <w:hideMark/>
+          </w:tcPr>
+          <w:p>
+            <w:pPr>
+              <w:spacing w:after="0" w:line="240" w:lineRule="auto"/>
+              <w:rPr>
+                <w:rFonts w:ascii="Montserrat" w:eastAsia="Times New Roman" w:hAnsi="Montserrat" w:cs="Calibri"/>
+                <w:color w:val="000000"/>
+                <w:kern w:val="0"/>
+                <w:sz w:val="20"/>
                 <w:szCs w:val="16"/>
                 <w14:ligatures w14:val="none"/>
               </w:rPr>
@@ -861,17 +1238,12 @@
       </w:tr>
       <w:tr>
         <w:trPr>
-          <w:trHeight w:val="360"/>
+          <w:trHeight w:val="20"/>
         </w:trPr>
         <w:tc>
           <w:tcPr>
             <w:tcW w:w="4420" w:type="dxa"/>
-            <w:tcBorders>
-              <w:top w:val="nil"/>
-              <w:left w:val="single" w:sz="4" w:space="0" w:color="auto"/>
-              <w:bottom w:val="single" w:sz="4" w:space="0" w:color="auto"/>
-              <w:right w:val="single" w:sz="4" w:space="0" w:color="auto"/>
-            </w:tcBorders>
+            <w:shd w:val="clear" w:color="000000" w:fill="E3EBF8"/>
             <w:noWrap/>
             <w:vAlign w:val="center"/>
             <w:hideMark/>
@@ -879,70 +1251,693 @@
           <w:p>
             <w:pPr>
               <w:spacing w:after="0" w:line="240" w:lineRule="auto"/>
-              <w:ind w:firstLineChars="100" w:firstLine="160"/>
-              <w:rPr>
-                <w:rFonts w:ascii="Montserrat" w:eastAsia="Times New Roman" w:hAnsi="Montserrat" w:cs="Calibri"/>
-                <w:color w:val="000000"/>
-                <w:kern w:val="0"/>
-                <w:sz w:val="16"/>
-                <w:szCs w:val="16"/>
-                <w14:ligatures w14:val="none"/>
-              </w:rPr>
-            </w:pPr>
-            <w:r>
-              <w:rPr>
-                <w:rFonts w:ascii="Montserrat" w:eastAsia="Times New Roman" w:hAnsi="Montserrat" w:cs="Calibri"/>
-                <w:color w:val="000000"/>
-                <w:kern w:val="0"/>
-                <w:sz w:val="16"/>
-                <w:szCs w:val="16"/>
-                <w14:ligatures w14:val="none"/>
-              </w:rPr>
-              <w:t>Ilaçet e këshilluara nga mjeku</w:t>
-            </w:r>
-          </w:p>
-        </w:tc>
-        <w:tc>
-          <w:tcPr>
-            <w:tcW w:w="2055" w:type="dxa"/>
-            <w:vMerge/>
-            <w:tcBorders>
-              <w:top w:val="nil"/>
-              <w:left w:val="single" w:sz="4" w:space="0" w:color="auto"/>
-              <w:bottom w:val="single" w:sz="4" w:space="0" w:color="auto"/>
-              <w:right w:val="single" w:sz="4" w:space="0" w:color="auto"/>
-            </w:tcBorders>
-            <w:vAlign w:val="center"/>
-            <w:hideMark/>
-          </w:tcPr>
-          <w:p>
-            <w:pPr>
-              <w:spacing w:after="0" w:line="240" w:lineRule="auto"/>
-              <w:rPr>
-                <w:rFonts w:ascii="Montserrat" w:eastAsia="Times New Roman" w:hAnsi="Montserrat" w:cs="Calibri"/>
-                <w:color w:val="000000"/>
-                <w:kern w:val="0"/>
-                <w:sz w:val="16"/>
-                <w:szCs w:val="16"/>
-                <w14:ligatures w14:val="none"/>
-              </w:rPr>
-            </w:pPr>
+              <w:ind w:firstLineChars="100" w:firstLine="201"/>
+              <w:rPr>
+                <w:rFonts w:ascii="Montserrat" w:eastAsia="Times New Roman" w:hAnsi="Montserrat" w:cs="Calibri"/>
+                <w:b/>
+                <w:bCs/>
+                <w:color w:val="007EC5"/>
+                <w:kern w:val="0"/>
+                <w:sz w:val="20"/>
+                <w:szCs w:val="16"/>
+                <w14:ligatures w14:val="none"/>
+              </w:rPr>
+            </w:pPr>
+            <w:r>
+              <w:rPr>
+                <w:rFonts w:ascii="Montserrat" w:eastAsia="Times New Roman" w:hAnsi="Montserrat" w:cs="Calibri"/>
+                <w:b/>
+                <w:bCs/>
+                <w:color w:val="007EC5"/>
+                <w:kern w:val="0"/>
+                <w:sz w:val="20"/>
+                <w:szCs w:val="16"/>
+                <w14:ligatures w14:val="none"/>
+              </w:rPr>
+              <w:t>Trajtime Mjekësore tjera</w:t>
+            </w:r>
+          </w:p>
+        </w:tc>
+        <w:tc>
+          <w:tcPr>
+            <w:tcW w:w="6195" w:type="dxa"/>
+            <w:shd w:val="clear" w:color="000000" w:fill="E3EBF8"/>
+            <w:noWrap/>
+            <w:vAlign w:val="center"/>
+            <w:hideMark/>
+          </w:tcPr>
+          <w:p>
+            <w:pPr>
+              <w:spacing w:after="0" w:line="240" w:lineRule="auto"/>
+              <w:rPr>
+                <w:rFonts w:ascii="Montserrat" w:eastAsia="Times New Roman" w:hAnsi="Montserrat" w:cs="Calibri"/>
+                <w:b/>
+                <w:bCs/>
+                <w:color w:val="007EC5"/>
+                <w:kern w:val="0"/>
+                <w:sz w:val="20"/>
+                <w:szCs w:val="16"/>
+                <w14:ligatures w14:val="none"/>
+              </w:rPr>
+            </w:pPr>
+            <w:r>
+              <w:rPr>
+                <w:rFonts w:ascii="Montserrat" w:eastAsia="Times New Roman" w:hAnsi="Montserrat" w:cs="Calibri"/>
+                <w:b/>
+                <w:bCs/>
+                <w:color w:val="007EC5"/>
+                <w:kern w:val="0"/>
+                <w:sz w:val="20"/>
+                <w:szCs w:val="16"/>
+                <w14:ligatures w14:val="none"/>
+              </w:rPr>
+              <w:t> </w:t>
+            </w:r>
           </w:p>
         </w:tc>
       </w:tr>
       <w:tr>
         <w:trPr>
-          <w:trHeight w:val="402"/>
+          <w:trHeight w:val="20"/>
         </w:trPr>
         <w:tc>
           <w:tcPr>
             <w:tcW w:w="4420" w:type="dxa"/>
-            <w:tcBorders>
-              <w:top w:val="nil"/>
-              <w:left w:val="single" w:sz="4" w:space="0" w:color="auto"/>
-              <w:bottom w:val="single" w:sz="4" w:space="0" w:color="auto"/>
-              <w:right w:val="nil"/>
-            </w:tcBorders>
+            <w:noWrap/>
+            <w:vAlign w:val="center"/>
+            <w:hideMark/>
+          </w:tcPr>
+          <w:p>
+            <w:pPr>
+              <w:spacing w:after="0" w:line="240" w:lineRule="auto"/>
+              <w:ind w:firstLineChars="100" w:firstLine="200"/>
+              <w:rPr>
+                <w:rFonts w:ascii="Montserrat" w:eastAsia="Times New Roman" w:hAnsi="Montserrat" w:cs="Calibri"/>
+                <w:color w:val="000000"/>
+                <w:kern w:val="0"/>
+                <w:sz w:val="20"/>
+                <w:szCs w:val="16"/>
+                <w14:ligatures w14:val="none"/>
+              </w:rPr>
+            </w:pPr>
+            <w:r>
+              <w:rPr>
+                <w:rFonts w:ascii="Montserrat" w:eastAsia="Times New Roman" w:hAnsi="Montserrat" w:cs="Calibri"/>
+                <w:color w:val="000000"/>
+                <w:kern w:val="0"/>
+                <w:sz w:val="20"/>
+                <w:szCs w:val="16"/>
+                <w14:ligatures w14:val="none"/>
+              </w:rPr>
+              <w:t>Kujdesi gjatë shtatzanisë dhe lindja</w:t>
+            </w:r>
+          </w:p>
+        </w:tc>
+        <w:tc>
+          <w:tcPr>
+            <w:tcW w:w="6195" w:type="dxa"/>
+            <w:vAlign w:val="bottom"/>
+            <w:hideMark/>
+          </w:tcPr>
+          <w:p>
+            <w:pPr>
+              <w:spacing w:after="0" w:line="240" w:lineRule="auto"/>
+              <w:jc w:val="center"/>
+              <w:rPr>
+                <w:rFonts w:ascii="Montserrat" w:eastAsia="Times New Roman" w:hAnsi="Montserrat" w:cs="Calibri"/>
+                <w:color w:val="000000"/>
+                <w:kern w:val="0"/>
+                <w:sz w:val="20"/>
+                <w:szCs w:val="16"/>
+                <w14:ligatures w14:val="none"/>
+              </w:rPr>
+            </w:pPr>
+            <w:r>
+              <w:rPr>
+                <w:rFonts w:ascii="Montserrat" w:hAnsi="Montserrat" w:cs="Calibri"/>
+                <w:color w:val="000000"/>
+                <w:sz w:val="20"/>
+                <w:szCs w:val="16"/>
+              </w:rPr>
+              <w:t>80% deri në € 1.200</w:t>
+            </w:r>
+          </w:p>
+        </w:tc>
+      </w:tr>
+      <w:tr>
+        <w:trPr>
+          <w:trHeight w:val="20"/>
+        </w:trPr>
+        <w:tc>
+          <w:tcPr>
+            <w:tcW w:w="4420" w:type="dxa"/>
+            <w:noWrap/>
+            <w:vAlign w:val="center"/>
+            <w:hideMark/>
+          </w:tcPr>
+          <w:p>
+            <w:pPr>
+              <w:spacing w:after="0" w:line="240" w:lineRule="auto"/>
+              <w:ind w:firstLineChars="100" w:firstLine="200"/>
+              <w:rPr>
+                <w:rFonts w:ascii="Montserrat" w:eastAsia="Times New Roman" w:hAnsi="Montserrat" w:cs="Calibri"/>
+                <w:color w:val="000000"/>
+                <w:kern w:val="0"/>
+                <w:sz w:val="20"/>
+                <w:szCs w:val="16"/>
+                <w14:ligatures w14:val="none"/>
+              </w:rPr>
+            </w:pPr>
+            <w:r>
+              <w:rPr>
+                <w:rFonts w:ascii="Montserrat" w:eastAsia="Times New Roman" w:hAnsi="Montserrat" w:cs="Calibri"/>
+                <w:color w:val="000000"/>
+                <w:kern w:val="0"/>
+                <w:sz w:val="20"/>
+                <w:szCs w:val="16"/>
+                <w14:ligatures w14:val="none"/>
+              </w:rPr>
+              <w:t>Kujdesi dentar</w:t>
+            </w:r>
+          </w:p>
+        </w:tc>
+        <w:tc>
+          <w:tcPr>
+            <w:tcW w:w="6195" w:type="dxa"/>
+            <w:vAlign w:val="bottom"/>
+            <w:hideMark/>
+          </w:tcPr>
+          <w:p>
+            <w:pPr>
+              <w:spacing w:after="0" w:line="240" w:lineRule="auto"/>
+              <w:jc w:val="center"/>
+              <w:rPr>
+                <w:rFonts w:ascii="Montserrat" w:eastAsia="Times New Roman" w:hAnsi="Montserrat" w:cs="Calibri"/>
+                <w:color w:val="000000"/>
+                <w:kern w:val="0"/>
+                <w:sz w:val="20"/>
+                <w:szCs w:val="16"/>
+                <w14:ligatures w14:val="none"/>
+              </w:rPr>
+            </w:pPr>
+            <w:r>
+              <w:rPr>
+                <w:rFonts w:ascii="Montserrat" w:hAnsi="Montserrat" w:cs="Calibri"/>
+                <w:color w:val="000000"/>
+                <w:sz w:val="20"/>
+                <w:szCs w:val="16"/>
+              </w:rPr>
+              <w:t>80% deri në € 120</w:t>
+            </w:r>
+          </w:p>
+        </w:tc>
+      </w:tr>
+      <w:tr>
+        <w:trPr>
+          <w:trHeight w:val="20"/>
+        </w:trPr>
+        <w:tc>
+          <w:tcPr>
+            <w:tcW w:w="4420" w:type="dxa"/>
+            <w:noWrap/>
+            <w:vAlign w:val="center"/>
+            <w:hideMark/>
+          </w:tcPr>
+          <w:p>
+            <w:pPr>
+              <w:spacing w:after="0" w:line="240" w:lineRule="auto"/>
+              <w:ind w:firstLineChars="100" w:firstLine="200"/>
+              <w:rPr>
+                <w:rFonts w:ascii="Montserrat" w:eastAsia="Times New Roman" w:hAnsi="Montserrat" w:cs="Calibri"/>
+                <w:color w:val="000000"/>
+                <w:kern w:val="0"/>
+                <w:sz w:val="20"/>
+                <w:szCs w:val="16"/>
+                <w14:ligatures w14:val="none"/>
+              </w:rPr>
+            </w:pPr>
+            <w:r>
+              <w:rPr>
+                <w:rFonts w:ascii="Montserrat" w:eastAsia="Times New Roman" w:hAnsi="Montserrat" w:cs="Calibri"/>
+                <w:color w:val="000000"/>
+                <w:kern w:val="0"/>
+                <w:sz w:val="20"/>
+                <w:szCs w:val="16"/>
+                <w14:ligatures w14:val="none"/>
+              </w:rPr>
+              <w:t>Kujdesi optik</w:t>
+            </w:r>
+          </w:p>
+        </w:tc>
+        <w:tc>
+          <w:tcPr>
+            <w:tcW w:w="6195" w:type="dxa"/>
+            <w:vAlign w:val="bottom"/>
+            <w:hideMark/>
+          </w:tcPr>
+          <w:p>
+            <w:pPr>
+              <w:spacing w:after="0" w:line="240" w:lineRule="auto"/>
+              <w:jc w:val="center"/>
+              <w:rPr>
+                <w:rFonts w:ascii="Montserrat" w:eastAsia="Times New Roman" w:hAnsi="Montserrat" w:cs="Calibri"/>
+                <w:color w:val="000000"/>
+                <w:kern w:val="0"/>
+                <w:sz w:val="20"/>
+                <w:szCs w:val="16"/>
+                <w14:ligatures w14:val="none"/>
+              </w:rPr>
+            </w:pPr>
+            <w:r>
+              <w:rPr>
+                <w:rFonts w:ascii="Montserrat" w:hAnsi="Montserrat" w:cs="Calibri"/>
+                <w:color w:val="000000"/>
+                <w:sz w:val="20"/>
+                <w:szCs w:val="16"/>
+              </w:rPr>
+              <w:t>80% deri në € 80</w:t>
+            </w:r>
+          </w:p>
+        </w:tc>
+      </w:tr>
+      <w:tr>
+        <w:trPr>
+          <w:trHeight w:val="20"/>
+        </w:trPr>
+        <w:tc>
+          <w:tcPr>
+            <w:tcW w:w="4420" w:type="dxa"/>
+            <w:noWrap/>
+            <w:vAlign w:val="center"/>
+            <w:hideMark/>
+          </w:tcPr>
+          <w:p>
+            <w:pPr>
+              <w:spacing w:after="0" w:line="240" w:lineRule="auto"/>
+              <w:ind w:firstLineChars="100" w:firstLine="200"/>
+              <w:rPr>
+                <w:rFonts w:ascii="Montserrat" w:eastAsia="Times New Roman" w:hAnsi="Montserrat" w:cs="Calibri"/>
+                <w:color w:val="000000"/>
+                <w:kern w:val="0"/>
+                <w:sz w:val="20"/>
+                <w:szCs w:val="16"/>
+                <w14:ligatures w14:val="none"/>
+              </w:rPr>
+            </w:pPr>
+            <w:r>
+              <w:rPr>
+                <w:rFonts w:ascii="Montserrat" w:eastAsia="Times New Roman" w:hAnsi="Montserrat" w:cs="Calibri"/>
+                <w:color w:val="000000"/>
+                <w:kern w:val="0"/>
+                <w:sz w:val="20"/>
+                <w:szCs w:val="16"/>
+                <w14:ligatures w14:val="none"/>
+              </w:rPr>
+              <w:t>Kujdesi për dëgjim</w:t>
+            </w:r>
+          </w:p>
+        </w:tc>
+        <w:tc>
+          <w:tcPr>
+            <w:tcW w:w="6195" w:type="dxa"/>
+            <w:vAlign w:val="bottom"/>
+            <w:hideMark/>
+          </w:tcPr>
+          <w:p>
+            <w:pPr>
+              <w:spacing w:after="0" w:line="240" w:lineRule="auto"/>
+              <w:jc w:val="center"/>
+              <w:rPr>
+                <w:rFonts w:ascii="Montserrat" w:eastAsia="Times New Roman" w:hAnsi="Montserrat" w:cs="Calibri"/>
+                <w:color w:val="000000"/>
+                <w:kern w:val="0"/>
+                <w:sz w:val="20"/>
+                <w:szCs w:val="16"/>
+                <w14:ligatures w14:val="none"/>
+              </w:rPr>
+            </w:pPr>
+            <w:r>
+              <w:rPr>
+                <w:rFonts w:ascii="Montserrat" w:hAnsi="Montserrat" w:cs="Calibri"/>
+                <w:color w:val="000000"/>
+                <w:sz w:val="20"/>
+                <w:szCs w:val="16"/>
+              </w:rPr>
+              <w:t>80% deri në € 120</w:t>
+            </w:r>
+          </w:p>
+        </w:tc>
+      </w:tr>
+      <w:tr>
+        <w:trPr>
+          <w:trHeight w:val="20"/>
+        </w:trPr>
+        <w:tc>
+          <w:tcPr>
+            <w:tcW w:w="4420" w:type="dxa"/>
+            <w:noWrap/>
+            <w:vAlign w:val="center"/>
+            <w:hideMark/>
+          </w:tcPr>
+          <w:p>
+            <w:pPr>
+              <w:spacing w:after="0" w:line="240" w:lineRule="auto"/>
+              <w:ind w:firstLineChars="100" w:firstLine="200"/>
+              <w:rPr>
+                <w:rFonts w:ascii="Montserrat" w:eastAsia="Times New Roman" w:hAnsi="Montserrat" w:cs="Calibri"/>
+                <w:color w:val="000000"/>
+                <w:kern w:val="0"/>
+                <w:sz w:val="20"/>
+                <w:szCs w:val="16"/>
+                <w14:ligatures w14:val="none"/>
+              </w:rPr>
+            </w:pPr>
+            <w:r>
+              <w:rPr>
+                <w:rFonts w:ascii="Montserrat" w:eastAsia="Times New Roman" w:hAnsi="Montserrat" w:cs="Calibri"/>
+                <w:color w:val="000000"/>
+                <w:kern w:val="0"/>
+                <w:sz w:val="20"/>
+                <w:szCs w:val="16"/>
+                <w14:ligatures w14:val="none"/>
+              </w:rPr>
+              <w:t>Kujdesi psikiatrik</w:t>
+            </w:r>
+          </w:p>
+        </w:tc>
+        <w:tc>
+          <w:tcPr>
+            <w:tcW w:w="6195" w:type="dxa"/>
+            <w:vAlign w:val="bottom"/>
+            <w:hideMark/>
+          </w:tcPr>
+          <w:p>
+            <w:pPr>
+              <w:spacing w:after="0" w:line="240" w:lineRule="auto"/>
+              <w:jc w:val="center"/>
+              <w:rPr>
+                <w:rFonts w:ascii="Montserrat" w:eastAsia="Times New Roman" w:hAnsi="Montserrat" w:cs="Calibri"/>
+                <w:color w:val="000000"/>
+                <w:kern w:val="0"/>
+                <w:sz w:val="20"/>
+                <w:szCs w:val="16"/>
+                <w14:ligatures w14:val="none"/>
+              </w:rPr>
+            </w:pPr>
+            <w:r>
+              <w:rPr>
+                <w:rFonts w:ascii="Montserrat" w:hAnsi="Montserrat" w:cs="Calibri"/>
+                <w:color w:val="000000"/>
+                <w:sz w:val="20"/>
+                <w:szCs w:val="16"/>
+              </w:rPr>
+              <w:t>80% deri në € 120</w:t>
+            </w:r>
+          </w:p>
+        </w:tc>
+      </w:tr>
+      <w:tr>
+        <w:trPr>
+          <w:trHeight w:val="20"/>
+        </w:trPr>
+        <w:tc>
+          <w:tcPr>
+            <w:tcW w:w="4420" w:type="dxa"/>
+            <w:noWrap/>
+            <w:vAlign w:val="center"/>
+            <w:hideMark/>
+          </w:tcPr>
+          <w:p>
+            <w:pPr>
+              <w:spacing w:after="0" w:line="240" w:lineRule="auto"/>
+              <w:ind w:firstLineChars="100" w:firstLine="200"/>
+              <w:rPr>
+                <w:rFonts w:ascii="Montserrat" w:eastAsia="Times New Roman" w:hAnsi="Montserrat" w:cs="Calibri"/>
+                <w:color w:val="000000"/>
+                <w:kern w:val="0"/>
+                <w:sz w:val="20"/>
+                <w:szCs w:val="16"/>
+                <w14:ligatures w14:val="none"/>
+              </w:rPr>
+            </w:pPr>
+            <w:r>
+              <w:rPr>
+                <w:rFonts w:ascii="Montserrat" w:eastAsia="Times New Roman" w:hAnsi="Montserrat" w:cs="Calibri"/>
+                <w:color w:val="000000"/>
+                <w:kern w:val="0"/>
+                <w:sz w:val="20"/>
+                <w:szCs w:val="16"/>
+                <w14:ligatures w14:val="none"/>
+              </w:rPr>
+              <w:t>Fizioterapia</w:t>
+            </w:r>
+          </w:p>
+        </w:tc>
+        <w:tc>
+          <w:tcPr>
+            <w:tcW w:w="6195" w:type="dxa"/>
+            <w:vAlign w:val="bottom"/>
+            <w:hideMark/>
+          </w:tcPr>
+          <w:p>
+            <w:pPr>
+              <w:spacing w:after="0" w:line="240" w:lineRule="auto"/>
+              <w:jc w:val="center"/>
+              <w:rPr>
+                <w:rFonts w:ascii="Montserrat" w:eastAsia="Times New Roman" w:hAnsi="Montserrat" w:cs="Calibri"/>
+                <w:color w:val="000000"/>
+                <w:kern w:val="0"/>
+                <w:sz w:val="20"/>
+                <w:szCs w:val="16"/>
+                <w14:ligatures w14:val="none"/>
+              </w:rPr>
+            </w:pPr>
+            <w:r>
+              <w:rPr>
+                <w:rFonts w:ascii="Montserrat" w:hAnsi="Montserrat" w:cs="Calibri"/>
+                <w:color w:val="000000"/>
+                <w:sz w:val="20"/>
+                <w:szCs w:val="16"/>
+              </w:rPr>
+              <w:t>80% deri në € 100</w:t>
+            </w:r>
+          </w:p>
+        </w:tc>
+      </w:tr>
+      <w:tr>
+        <w:trPr>
+          <w:trHeight w:val="20"/>
+        </w:trPr>
+        <w:tc>
+          <w:tcPr>
+            <w:tcW w:w="4420" w:type="dxa"/>
+            <w:noWrap/>
+            <w:vAlign w:val="center"/>
+            <w:hideMark/>
+          </w:tcPr>
+          <w:p>
+            <w:pPr>
+              <w:spacing w:after="0" w:line="240" w:lineRule="auto"/>
+              <w:ind w:firstLineChars="100" w:firstLine="200"/>
+              <w:rPr>
+                <w:rFonts w:ascii="Montserrat" w:eastAsia="Times New Roman" w:hAnsi="Montserrat" w:cs="Calibri"/>
+                <w:color w:val="000000"/>
+                <w:kern w:val="0"/>
+                <w:sz w:val="20"/>
+                <w:szCs w:val="16"/>
+                <w14:ligatures w14:val="none"/>
+              </w:rPr>
+            </w:pPr>
+            <w:r>
+              <w:rPr>
+                <w:rFonts w:ascii="Montserrat" w:eastAsia="Times New Roman" w:hAnsi="Montserrat" w:cs="Calibri"/>
+                <w:color w:val="000000"/>
+                <w:kern w:val="0"/>
+                <w:sz w:val="20"/>
+                <w:szCs w:val="16"/>
+                <w14:ligatures w14:val="none"/>
+              </w:rPr>
+              <w:t>Autoambulanca brenda dhe jashtë Kosovës</w:t>
+            </w:r>
+          </w:p>
+        </w:tc>
+        <w:tc>
+          <w:tcPr>
+            <w:tcW w:w="6195" w:type="dxa"/>
+            <w:noWrap/>
+            <w:vAlign w:val="bottom"/>
+            <w:hideMark/>
+          </w:tcPr>
+          <w:p>
+            <w:pPr>
+              <w:spacing w:after="0" w:line="240" w:lineRule="auto"/>
+              <w:jc w:val="center"/>
+              <w:rPr>
+                <w:rFonts w:ascii="Montserrat" w:eastAsia="Times New Roman" w:hAnsi="Montserrat" w:cs="Calibri"/>
+                <w:color w:val="000000"/>
+                <w:kern w:val="0"/>
+                <w:sz w:val="20"/>
+                <w:szCs w:val="16"/>
+                <w14:ligatures w14:val="none"/>
+              </w:rPr>
+            </w:pPr>
+            <w:r>
+              <w:rPr>
+                <w:rFonts w:ascii="Montserrat" w:hAnsi="Montserrat" w:cs="Calibri"/>
+                <w:color w:val="000000"/>
+                <w:sz w:val="20"/>
+                <w:szCs w:val="16"/>
+              </w:rPr>
+              <w:t>100% deri në € 200</w:t>
+            </w:r>
+          </w:p>
+        </w:tc>
+      </w:tr>
+      <w:tr>
+        <w:trPr>
+          <w:trHeight w:val="20"/>
+        </w:trPr>
+        <w:tc>
+          <w:tcPr>
+            <w:tcW w:w="4420" w:type="dxa"/>
+            <w:noWrap/>
+            <w:vAlign w:val="center"/>
+            <w:hideMark/>
+          </w:tcPr>
+          <w:p>
+            <w:pPr>
+              <w:spacing w:after="0" w:line="240" w:lineRule="auto"/>
+              <w:ind w:firstLineChars="100" w:firstLine="200"/>
+              <w:rPr>
+                <w:rFonts w:ascii="Montserrat" w:eastAsia="Times New Roman" w:hAnsi="Montserrat" w:cs="Calibri"/>
+                <w:color w:val="000000"/>
+                <w:kern w:val="0"/>
+                <w:sz w:val="20"/>
+                <w:szCs w:val="16"/>
+                <w14:ligatures w14:val="none"/>
+              </w:rPr>
+            </w:pPr>
+            <w:r>
+              <w:rPr>
+                <w:rFonts w:ascii="Montserrat" w:eastAsia="Times New Roman" w:hAnsi="Montserrat" w:cs="Calibri"/>
+                <w:color w:val="000000"/>
+                <w:kern w:val="0"/>
+                <w:sz w:val="20"/>
+                <w:szCs w:val="16"/>
+                <w14:ligatures w14:val="none"/>
+              </w:rPr>
+              <w:t>Shpenzimet e mjekimit si pasojë e aksidentit</w:t>
+            </w:r>
+          </w:p>
+        </w:tc>
+        <w:tc>
+          <w:tcPr>
+            <w:tcW w:w="6195" w:type="dxa"/>
+            <w:noWrap/>
+            <w:vAlign w:val="bottom"/>
+            <w:hideMark/>
+          </w:tcPr>
+          <w:p>
+            <w:pPr>
+              <w:spacing w:after="0" w:line="240" w:lineRule="auto"/>
+              <w:jc w:val="center"/>
+              <w:rPr>
+                <w:rFonts w:ascii="Montserrat" w:eastAsia="Times New Roman" w:hAnsi="Montserrat" w:cs="Calibri"/>
+                <w:color w:val="000000"/>
+                <w:kern w:val="0"/>
+                <w:sz w:val="20"/>
+                <w:szCs w:val="16"/>
+                <w14:ligatures w14:val="none"/>
+              </w:rPr>
+            </w:pPr>
+            <w:r>
+              <w:rPr>
+                <w:rFonts w:ascii="Montserrat" w:hAnsi="Montserrat" w:cs="Calibri"/>
+                <w:color w:val="000000"/>
+                <w:sz w:val="20"/>
+                <w:szCs w:val="16"/>
+              </w:rPr>
+              <w:t>100% deri në € 20.000</w:t>
+            </w:r>
+          </w:p>
+        </w:tc>
+      </w:tr>
+      <w:tr>
+        <w:trPr>
+          <w:trHeight w:val="20"/>
+        </w:trPr>
+        <w:tc>
+          <w:tcPr>
+            <w:tcW w:w="4420" w:type="dxa"/>
+            <w:noWrap/>
+            <w:vAlign w:val="center"/>
+            <w:hideMark/>
+          </w:tcPr>
+          <w:p>
+            <w:pPr>
+              <w:spacing w:after="0" w:line="240" w:lineRule="auto"/>
+              <w:ind w:firstLineChars="100" w:firstLine="200"/>
+              <w:rPr>
+                <w:rFonts w:ascii="Montserrat" w:eastAsia="Times New Roman" w:hAnsi="Montserrat" w:cs="Calibri"/>
+                <w:color w:val="000000"/>
+                <w:kern w:val="0"/>
+                <w:sz w:val="20"/>
+                <w:szCs w:val="16"/>
+                <w14:ligatures w14:val="none"/>
+              </w:rPr>
+            </w:pPr>
+            <w:r>
+              <w:rPr>
+                <w:rFonts w:ascii="Montserrat" w:eastAsia="Times New Roman" w:hAnsi="Montserrat" w:cs="Calibri"/>
+                <w:color w:val="000000"/>
+                <w:kern w:val="0"/>
+                <w:sz w:val="20"/>
+                <w:szCs w:val="16"/>
+                <w14:ligatures w14:val="none"/>
+              </w:rPr>
+              <w:t>Trajtimet onkologjike</w:t>
+            </w:r>
+          </w:p>
+        </w:tc>
+        <w:tc>
+          <w:tcPr>
+            <w:tcW w:w="6195" w:type="dxa"/>
+            <w:noWrap/>
+            <w:vAlign w:val="bottom"/>
+            <w:hideMark/>
+          </w:tcPr>
+          <w:p>
+            <w:pPr>
+              <w:spacing w:after="0" w:line="240" w:lineRule="auto"/>
+              <w:jc w:val="center"/>
+              <w:rPr>
+                <w:rFonts w:ascii="Montserrat" w:eastAsia="Times New Roman" w:hAnsi="Montserrat" w:cs="Calibri"/>
+                <w:color w:val="000000"/>
+                <w:kern w:val="0"/>
+                <w:sz w:val="20"/>
+                <w:szCs w:val="16"/>
+                <w14:ligatures w14:val="none"/>
+              </w:rPr>
+            </w:pPr>
+            <w:r>
+              <w:rPr>
+                <w:rFonts w:ascii="Montserrat" w:hAnsi="Montserrat" w:cs="Calibri"/>
+                <w:color w:val="000000"/>
+                <w:sz w:val="20"/>
+                <w:szCs w:val="16"/>
+              </w:rPr>
+              <w:t>100% deri në € 20.000</w:t>
+            </w:r>
+          </w:p>
+        </w:tc>
+      </w:tr>
+      <w:tr>
+        <w:trPr>
+          <w:trHeight w:val="20"/>
+        </w:trPr>
+        <w:tc>
+          <w:tcPr>
+            <w:tcW w:w="4420" w:type="dxa"/>
             <w:shd w:val="clear" w:color="000000" w:fill="E3EBF8"/>
             <w:noWrap/>
             <w:vAlign w:val="center"/>
@@ -951,14 +1946,14 @@
           <w:p>
             <w:pPr>
               <w:spacing w:after="0" w:line="240" w:lineRule="auto"/>
-              <w:ind w:firstLineChars="100" w:firstLine="161"/>
+              <w:ind w:firstLineChars="100" w:firstLine="201"/>
               <w:rPr>
                 <w:rFonts w:ascii="Montserrat" w:eastAsia="Times New Roman" w:hAnsi="Montserrat" w:cs="Calibri"/>
                 <w:b/>
                 <w:bCs/>
                 <w:color w:val="007EC5"/>
                 <w:kern w:val="0"/>
-                <w:sz w:val="16"/>
+                <w:sz w:val="20"/>
                 <w:szCs w:val="16"/>
                 <w14:ligatures w14:val="none"/>
               </w:rPr>
@@ -970,23 +1965,17 @@
                 <w:bCs/>
                 <w:color w:val="007EC5"/>
                 <w:kern w:val="0"/>
-                <w:sz w:val="16"/>
-                <w:szCs w:val="16"/>
-                <w14:ligatures w14:val="none"/>
-              </w:rPr>
-              <w:t>Trajtimet Mjekësore Ambulantore</w:t>
-            </w:r>
-          </w:p>
-        </w:tc>
-        <w:tc>
-          <w:tcPr>
-            <w:tcW w:w="2055" w:type="dxa"/>
-            <w:tcBorders>
-              <w:top w:val="nil"/>
-              <w:left w:val="nil"/>
-              <w:bottom w:val="single" w:sz="4" w:space="0" w:color="auto"/>
-              <w:right w:val="nil"/>
-            </w:tcBorders>
+                <w:sz w:val="20"/>
+                <w:szCs w:val="16"/>
+                <w14:ligatures w14:val="none"/>
+              </w:rPr>
+              <w:t xml:space="preserve">Primet mujore </w:t>
+            </w:r>
+          </w:p>
+        </w:tc>
+        <w:tc>
+          <w:tcPr>
+            <w:tcW w:w="6195" w:type="dxa"/>
             <w:shd w:val="clear" w:color="000000" w:fill="E3EBF8"/>
             <w:noWrap/>
             <w:vAlign w:val="center"/>
@@ -995,1385 +1984,14 @@
           <w:p>
             <w:pPr>
               <w:spacing w:after="0" w:line="240" w:lineRule="auto"/>
+              <w:jc w:val="center"/>
               <w:rPr>
                 <w:rFonts w:ascii="Montserrat" w:eastAsia="Times New Roman" w:hAnsi="Montserrat" w:cs="Calibri"/>
                 <w:b/>
                 <w:bCs/>
                 <w:color w:val="007EC5"/>
                 <w:kern w:val="0"/>
-                <w:sz w:val="16"/>
-                <w:szCs w:val="16"/>
-                <w14:ligatures w14:val="none"/>
-              </w:rPr>
-            </w:pPr>
-            <w:r>
-              <w:rPr>
-                <w:rFonts w:ascii="Montserrat" w:eastAsia="Times New Roman" w:hAnsi="Montserrat" w:cs="Calibri"/>
-                <w:b/>
-                <w:bCs/>
-                <w:color w:val="007EC5"/>
-                <w:kern w:val="0"/>
-                <w:sz w:val="16"/>
-                <w:szCs w:val="16"/>
-                <w14:ligatures w14:val="none"/>
-              </w:rPr>
-              <w:t> </w:t>
-            </w:r>
-          </w:p>
-        </w:tc>
-      </w:tr>
-      <w:tr>
-        <w:trPr>
-          <w:trHeight w:val="360"/>
-        </w:trPr>
-        <w:tc>
-          <w:tcPr>
-            <w:tcW w:w="4420" w:type="dxa"/>
-            <w:tcBorders>
-              <w:top w:val="nil"/>
-              <w:left w:val="single" w:sz="4" w:space="0" w:color="auto"/>
-              <w:bottom w:val="single" w:sz="4" w:space="0" w:color="auto"/>
-              <w:right w:val="single" w:sz="4" w:space="0" w:color="auto"/>
-            </w:tcBorders>
-            <w:noWrap/>
-            <w:vAlign w:val="center"/>
-            <w:hideMark/>
-          </w:tcPr>
-          <w:p>
-            <w:pPr>
-              <w:spacing w:after="0" w:line="240" w:lineRule="auto"/>
-              <w:ind w:firstLineChars="100" w:firstLine="160"/>
-              <w:rPr>
-                <w:rFonts w:ascii="Montserrat" w:eastAsia="Times New Roman" w:hAnsi="Montserrat" w:cs="Calibri"/>
-                <w:color w:val="000000"/>
-                <w:kern w:val="0"/>
-                <w:sz w:val="16"/>
-                <w:szCs w:val="16"/>
-                <w14:ligatures w14:val="none"/>
-              </w:rPr>
-            </w:pPr>
-            <w:r>
-              <w:rPr>
-                <w:rFonts w:ascii="Montserrat" w:eastAsia="Times New Roman" w:hAnsi="Montserrat" w:cs="Calibri"/>
-                <w:color w:val="000000"/>
-                <w:kern w:val="0"/>
-                <w:sz w:val="16"/>
-                <w:szCs w:val="16"/>
-                <w14:ligatures w14:val="none"/>
-              </w:rPr>
-              <w:t>Shpenzimet për mjekun e përgjithshëm</w:t>
-            </w:r>
-          </w:p>
-        </w:tc>
-        <w:tc>
-          <w:tcPr>
-            <w:tcW w:w="2055" w:type="dxa"/>
-            <w:vMerge w:val="restart"/>
-            <w:tcBorders>
-              <w:top w:val="nil"/>
-              <w:left w:val="single" w:sz="4" w:space="0" w:color="auto"/>
-              <w:bottom w:val="single" w:sz="4" w:space="0" w:color="auto"/>
-              <w:right w:val="single" w:sz="4" w:space="0" w:color="auto"/>
-            </w:tcBorders>
-            <w:vAlign w:val="center"/>
-            <w:hideMark/>
-          </w:tcPr>
-          <w:p>
-            <w:pPr>
-              <w:spacing w:after="0" w:line="240" w:lineRule="auto"/>
-              <w:jc w:val="center"/>
-              <w:rPr>
-                <w:rFonts w:ascii="Montserrat" w:eastAsia="Times New Roman" w:hAnsi="Montserrat" w:cs="Calibri"/>
-                <w:color w:val="000000"/>
-                <w:kern w:val="0"/>
-                <w:sz w:val="16"/>
-                <w:szCs w:val="16"/>
-                <w14:ligatures w14:val="none"/>
-              </w:rPr>
-            </w:pPr>
-            <w:r>
-              <w:rPr>
-                <w:rFonts w:ascii="Montserrat" w:eastAsia="Times New Roman" w:hAnsi="Montserrat" w:cs="Calibri"/>
-                <w:color w:val="000000"/>
-                <w:kern w:val="0"/>
-                <w:sz w:val="16"/>
-                <w:szCs w:val="16"/>
-                <w14:ligatures w14:val="none"/>
-              </w:rPr>
-              <w:t>80%</w:t>
-            </w:r>
-          </w:p>
-        </w:tc>
-      </w:tr>
-      <w:tr>
-        <w:trPr>
-          <w:trHeight w:val="360"/>
-        </w:trPr>
-        <w:tc>
-          <w:tcPr>
-            <w:tcW w:w="4420" w:type="dxa"/>
-            <w:tcBorders>
-              <w:top w:val="nil"/>
-              <w:left w:val="single" w:sz="4" w:space="0" w:color="auto"/>
-              <w:bottom w:val="single" w:sz="4" w:space="0" w:color="auto"/>
-              <w:right w:val="single" w:sz="4" w:space="0" w:color="auto"/>
-            </w:tcBorders>
-            <w:noWrap/>
-            <w:vAlign w:val="center"/>
-            <w:hideMark/>
-          </w:tcPr>
-          <w:p>
-            <w:pPr>
-              <w:spacing w:after="0" w:line="240" w:lineRule="auto"/>
-              <w:ind w:firstLineChars="100" w:firstLine="160"/>
-              <w:rPr>
-                <w:rFonts w:ascii="Montserrat" w:eastAsia="Times New Roman" w:hAnsi="Montserrat" w:cs="Calibri"/>
-                <w:color w:val="000000"/>
-                <w:kern w:val="0"/>
-                <w:sz w:val="16"/>
-                <w:szCs w:val="16"/>
-                <w14:ligatures w14:val="none"/>
-              </w:rPr>
-            </w:pPr>
-            <w:r>
-              <w:rPr>
-                <w:rFonts w:ascii="Montserrat" w:eastAsia="Times New Roman" w:hAnsi="Montserrat" w:cs="Calibri"/>
-                <w:color w:val="000000"/>
-                <w:kern w:val="0"/>
-                <w:sz w:val="16"/>
-                <w:szCs w:val="16"/>
-                <w14:ligatures w14:val="none"/>
-              </w:rPr>
-              <w:t>Shpenzimet për mjekun specialist</w:t>
-            </w:r>
-          </w:p>
-        </w:tc>
-        <w:tc>
-          <w:tcPr>
-            <w:tcW w:w="2055" w:type="dxa"/>
-            <w:vMerge/>
-            <w:tcBorders>
-              <w:top w:val="nil"/>
-              <w:left w:val="single" w:sz="4" w:space="0" w:color="auto"/>
-              <w:bottom w:val="single" w:sz="4" w:space="0" w:color="auto"/>
-              <w:right w:val="single" w:sz="4" w:space="0" w:color="auto"/>
-            </w:tcBorders>
-            <w:vAlign w:val="center"/>
-            <w:hideMark/>
-          </w:tcPr>
-          <w:p>
-            <w:pPr>
-              <w:spacing w:after="0" w:line="240" w:lineRule="auto"/>
-              <w:rPr>
-                <w:rFonts w:ascii="Montserrat" w:eastAsia="Times New Roman" w:hAnsi="Montserrat" w:cs="Calibri"/>
-                <w:color w:val="000000"/>
-                <w:kern w:val="0"/>
-                <w:sz w:val="16"/>
-                <w:szCs w:val="16"/>
-                <w14:ligatures w14:val="none"/>
-              </w:rPr>
-            </w:pPr>
-          </w:p>
-        </w:tc>
-      </w:tr>
-      <w:tr>
-        <w:trPr>
-          <w:trHeight w:val="360"/>
-        </w:trPr>
-        <w:tc>
-          <w:tcPr>
-            <w:tcW w:w="4420" w:type="dxa"/>
-            <w:tcBorders>
-              <w:top w:val="nil"/>
-              <w:left w:val="single" w:sz="4" w:space="0" w:color="auto"/>
-              <w:bottom w:val="single" w:sz="4" w:space="0" w:color="auto"/>
-              <w:right w:val="single" w:sz="4" w:space="0" w:color="auto"/>
-            </w:tcBorders>
-            <w:noWrap/>
-            <w:vAlign w:val="center"/>
-            <w:hideMark/>
-          </w:tcPr>
-          <w:p>
-            <w:pPr>
-              <w:spacing w:after="0" w:line="240" w:lineRule="auto"/>
-              <w:ind w:firstLineChars="100" w:firstLine="160"/>
-              <w:rPr>
-                <w:rFonts w:ascii="Montserrat" w:eastAsia="Times New Roman" w:hAnsi="Montserrat" w:cs="Calibri"/>
-                <w:color w:val="000000"/>
-                <w:kern w:val="0"/>
-                <w:sz w:val="16"/>
-                <w:szCs w:val="16"/>
-                <w14:ligatures w14:val="none"/>
-              </w:rPr>
-            </w:pPr>
-            <w:r>
-              <w:rPr>
-                <w:rFonts w:ascii="Montserrat" w:eastAsia="Times New Roman" w:hAnsi="Montserrat" w:cs="Calibri"/>
-                <w:color w:val="000000"/>
-                <w:kern w:val="0"/>
-                <w:sz w:val="16"/>
-                <w:szCs w:val="16"/>
-                <w14:ligatures w14:val="none"/>
-              </w:rPr>
-              <w:t>Kirurgjia ditore</w:t>
-            </w:r>
-          </w:p>
-        </w:tc>
-        <w:tc>
-          <w:tcPr>
-            <w:tcW w:w="2055" w:type="dxa"/>
-            <w:vMerge/>
-            <w:tcBorders>
-              <w:top w:val="nil"/>
-              <w:left w:val="single" w:sz="4" w:space="0" w:color="auto"/>
-              <w:bottom w:val="single" w:sz="4" w:space="0" w:color="auto"/>
-              <w:right w:val="single" w:sz="4" w:space="0" w:color="auto"/>
-            </w:tcBorders>
-            <w:vAlign w:val="center"/>
-            <w:hideMark/>
-          </w:tcPr>
-          <w:p>
-            <w:pPr>
-              <w:spacing w:after="0" w:line="240" w:lineRule="auto"/>
-              <w:rPr>
-                <w:rFonts w:ascii="Montserrat" w:eastAsia="Times New Roman" w:hAnsi="Montserrat" w:cs="Calibri"/>
-                <w:color w:val="000000"/>
-                <w:kern w:val="0"/>
-                <w:sz w:val="16"/>
-                <w:szCs w:val="16"/>
-                <w14:ligatures w14:val="none"/>
-              </w:rPr>
-            </w:pPr>
-          </w:p>
-        </w:tc>
-      </w:tr>
-      <w:tr>
-        <w:trPr>
-          <w:trHeight w:val="360"/>
-        </w:trPr>
-        <w:tc>
-          <w:tcPr>
-            <w:tcW w:w="4420" w:type="dxa"/>
-            <w:tcBorders>
-              <w:top w:val="nil"/>
-              <w:left w:val="single" w:sz="4" w:space="0" w:color="auto"/>
-              <w:bottom w:val="single" w:sz="4" w:space="0" w:color="auto"/>
-              <w:right w:val="single" w:sz="4" w:space="0" w:color="auto"/>
-            </w:tcBorders>
-            <w:vAlign w:val="center"/>
-            <w:hideMark/>
-          </w:tcPr>
-          <w:p>
-            <w:pPr>
-              <w:spacing w:after="0" w:line="240" w:lineRule="auto"/>
-              <w:ind w:firstLineChars="100" w:firstLine="140"/>
-              <w:rPr>
-                <w:rFonts w:ascii="Montserrat" w:eastAsia="Times New Roman" w:hAnsi="Montserrat" w:cs="Calibri"/>
-                <w:color w:val="000000"/>
-                <w:kern w:val="0"/>
-                <w:sz w:val="14"/>
-                <w:szCs w:val="14"/>
-                <w14:ligatures w14:val="none"/>
-              </w:rPr>
-            </w:pPr>
-            <w:r>
-              <w:rPr>
-                <w:rFonts w:ascii="Montserrat" w:eastAsia="Times New Roman" w:hAnsi="Montserrat" w:cs="Calibri"/>
-                <w:color w:val="000000"/>
-                <w:kern w:val="0"/>
-                <w:sz w:val="14"/>
-                <w:szCs w:val="14"/>
-                <w14:ligatures w14:val="none"/>
-              </w:rPr>
-              <w:t>Kontrolle diagnostifikuese, duke përfshirë ato patologjike,    rreze X, skane CT, skane MRI, skane PET</w:t>
-            </w:r>
-          </w:p>
-        </w:tc>
-        <w:tc>
-          <w:tcPr>
-            <w:tcW w:w="2055" w:type="dxa"/>
-            <w:vMerge/>
-            <w:tcBorders>
-              <w:top w:val="nil"/>
-              <w:left w:val="single" w:sz="4" w:space="0" w:color="auto"/>
-              <w:bottom w:val="single" w:sz="4" w:space="0" w:color="auto"/>
-              <w:right w:val="single" w:sz="4" w:space="0" w:color="auto"/>
-            </w:tcBorders>
-            <w:vAlign w:val="center"/>
-            <w:hideMark/>
-          </w:tcPr>
-          <w:p>
-            <w:pPr>
-              <w:spacing w:after="0" w:line="240" w:lineRule="auto"/>
-              <w:rPr>
-                <w:rFonts w:ascii="Montserrat" w:eastAsia="Times New Roman" w:hAnsi="Montserrat" w:cs="Calibri"/>
-                <w:color w:val="000000"/>
-                <w:kern w:val="0"/>
-                <w:sz w:val="16"/>
-                <w:szCs w:val="16"/>
-                <w14:ligatures w14:val="none"/>
-              </w:rPr>
-            </w:pPr>
-          </w:p>
-        </w:tc>
-      </w:tr>
-      <w:tr>
-        <w:trPr>
-          <w:trHeight w:val="360"/>
-        </w:trPr>
-        <w:tc>
-          <w:tcPr>
-            <w:tcW w:w="4420" w:type="dxa"/>
-            <w:tcBorders>
-              <w:top w:val="nil"/>
-              <w:left w:val="single" w:sz="4" w:space="0" w:color="auto"/>
-              <w:bottom w:val="single" w:sz="4" w:space="0" w:color="auto"/>
-              <w:right w:val="single" w:sz="4" w:space="0" w:color="auto"/>
-            </w:tcBorders>
-            <w:noWrap/>
-            <w:vAlign w:val="center"/>
-            <w:hideMark/>
-          </w:tcPr>
-          <w:p>
-            <w:pPr>
-              <w:spacing w:after="0" w:line="240" w:lineRule="auto"/>
-              <w:ind w:firstLineChars="100" w:firstLine="160"/>
-              <w:rPr>
-                <w:rFonts w:ascii="Montserrat" w:eastAsia="Times New Roman" w:hAnsi="Montserrat" w:cs="Calibri"/>
-                <w:color w:val="000000"/>
-                <w:kern w:val="0"/>
-                <w:sz w:val="16"/>
-                <w:szCs w:val="16"/>
-                <w14:ligatures w14:val="none"/>
-              </w:rPr>
-            </w:pPr>
-            <w:r>
-              <w:rPr>
-                <w:rFonts w:ascii="Montserrat" w:eastAsia="Times New Roman" w:hAnsi="Montserrat" w:cs="Calibri"/>
-                <w:color w:val="000000"/>
-                <w:kern w:val="0"/>
-                <w:sz w:val="16"/>
-                <w:szCs w:val="16"/>
-                <w14:ligatures w14:val="none"/>
-              </w:rPr>
-              <w:t>Analizat laboratorike</w:t>
-            </w:r>
-          </w:p>
-        </w:tc>
-        <w:tc>
-          <w:tcPr>
-            <w:tcW w:w="2055" w:type="dxa"/>
-            <w:vMerge/>
-            <w:tcBorders>
-              <w:top w:val="nil"/>
-              <w:left w:val="single" w:sz="4" w:space="0" w:color="auto"/>
-              <w:bottom w:val="single" w:sz="4" w:space="0" w:color="auto"/>
-              <w:right w:val="single" w:sz="4" w:space="0" w:color="auto"/>
-            </w:tcBorders>
-            <w:vAlign w:val="center"/>
-            <w:hideMark/>
-          </w:tcPr>
-          <w:p>
-            <w:pPr>
-              <w:spacing w:after="0" w:line="240" w:lineRule="auto"/>
-              <w:rPr>
-                <w:rFonts w:ascii="Montserrat" w:eastAsia="Times New Roman" w:hAnsi="Montserrat" w:cs="Calibri"/>
-                <w:color w:val="000000"/>
-                <w:kern w:val="0"/>
-                <w:sz w:val="16"/>
-                <w:szCs w:val="16"/>
-                <w14:ligatures w14:val="none"/>
-              </w:rPr>
-            </w:pPr>
-          </w:p>
-        </w:tc>
-      </w:tr>
-      <w:tr>
-        <w:trPr>
-          <w:trHeight w:val="360"/>
-        </w:trPr>
-        <w:tc>
-          <w:tcPr>
-            <w:tcW w:w="4420" w:type="dxa"/>
-            <w:tcBorders>
-              <w:top w:val="nil"/>
-              <w:left w:val="single" w:sz="4" w:space="0" w:color="auto"/>
-              <w:bottom w:val="single" w:sz="4" w:space="0" w:color="auto"/>
-              <w:right w:val="single" w:sz="4" w:space="0" w:color="auto"/>
-            </w:tcBorders>
-            <w:noWrap/>
-            <w:vAlign w:val="center"/>
-            <w:hideMark/>
-          </w:tcPr>
-          <w:p>
-            <w:pPr>
-              <w:spacing w:after="0" w:line="240" w:lineRule="auto"/>
-              <w:ind w:firstLineChars="100" w:firstLine="160"/>
-              <w:rPr>
-                <w:rFonts w:ascii="Montserrat" w:eastAsia="Times New Roman" w:hAnsi="Montserrat" w:cs="Calibri"/>
-                <w:color w:val="000000"/>
-                <w:kern w:val="0"/>
-                <w:sz w:val="16"/>
-                <w:szCs w:val="16"/>
-                <w14:ligatures w14:val="none"/>
-              </w:rPr>
-            </w:pPr>
-            <w:r>
-              <w:rPr>
-                <w:rFonts w:ascii="Montserrat" w:eastAsia="Times New Roman" w:hAnsi="Montserrat" w:cs="Calibri"/>
-                <w:color w:val="000000"/>
-                <w:kern w:val="0"/>
-                <w:sz w:val="16"/>
-                <w:szCs w:val="16"/>
-                <w14:ligatures w14:val="none"/>
-              </w:rPr>
-              <w:t>Ilaçet e këshilluara nga mjeku</w:t>
-            </w:r>
-          </w:p>
-        </w:tc>
-        <w:tc>
-          <w:tcPr>
-            <w:tcW w:w="2055" w:type="dxa"/>
-            <w:vMerge/>
-            <w:tcBorders>
-              <w:top w:val="nil"/>
-              <w:left w:val="single" w:sz="4" w:space="0" w:color="auto"/>
-              <w:bottom w:val="single" w:sz="4" w:space="0" w:color="auto"/>
-              <w:right w:val="single" w:sz="4" w:space="0" w:color="auto"/>
-            </w:tcBorders>
-            <w:vAlign w:val="center"/>
-            <w:hideMark/>
-          </w:tcPr>
-          <w:p>
-            <w:pPr>
-              <w:spacing w:after="0" w:line="240" w:lineRule="auto"/>
-              <w:rPr>
-                <w:rFonts w:ascii="Montserrat" w:eastAsia="Times New Roman" w:hAnsi="Montserrat" w:cs="Calibri"/>
-                <w:color w:val="000000"/>
-                <w:kern w:val="0"/>
-                <w:sz w:val="16"/>
-                <w:szCs w:val="16"/>
-                <w14:ligatures w14:val="none"/>
-              </w:rPr>
-            </w:pPr>
-          </w:p>
-        </w:tc>
-      </w:tr>
-      <w:tr>
-        <w:trPr>
-          <w:trHeight w:val="402"/>
-        </w:trPr>
-        <w:tc>
-          <w:tcPr>
-            <w:tcW w:w="4420" w:type="dxa"/>
-            <w:tcBorders>
-              <w:top w:val="nil"/>
-              <w:left w:val="single" w:sz="4" w:space="0" w:color="auto"/>
-              <w:bottom w:val="single" w:sz="4" w:space="0" w:color="auto"/>
-              <w:right w:val="nil"/>
-            </w:tcBorders>
-            <w:shd w:val="clear" w:color="000000" w:fill="E3EBF8"/>
-            <w:noWrap/>
-            <w:vAlign w:val="center"/>
-            <w:hideMark/>
-          </w:tcPr>
-          <w:p>
-            <w:pPr>
-              <w:spacing w:after="0" w:line="240" w:lineRule="auto"/>
-              <w:ind w:firstLineChars="100" w:firstLine="161"/>
-              <w:rPr>
-                <w:rFonts w:ascii="Montserrat" w:eastAsia="Times New Roman" w:hAnsi="Montserrat" w:cs="Calibri"/>
-                <w:b/>
-                <w:bCs/>
-                <w:color w:val="007EC5"/>
-                <w:kern w:val="0"/>
-                <w:sz w:val="16"/>
-                <w:szCs w:val="16"/>
-                <w14:ligatures w14:val="none"/>
-              </w:rPr>
-            </w:pPr>
-            <w:r>
-              <w:rPr>
-                <w:rFonts w:ascii="Montserrat" w:eastAsia="Times New Roman" w:hAnsi="Montserrat" w:cs="Calibri"/>
-                <w:b/>
-                <w:bCs/>
-                <w:color w:val="007EC5"/>
-                <w:kern w:val="0"/>
-                <w:sz w:val="16"/>
-                <w:szCs w:val="16"/>
-                <w14:ligatures w14:val="none"/>
-              </w:rPr>
-              <w:t>Trajtime Mjekësore tjera</w:t>
-            </w:r>
-          </w:p>
-        </w:tc>
-        <w:tc>
-          <w:tcPr>
-            <w:tcW w:w="2055" w:type="dxa"/>
-            <w:tcBorders>
-              <w:top w:val="nil"/>
-              <w:left w:val="nil"/>
-              <w:bottom w:val="single" w:sz="4" w:space="0" w:color="auto"/>
-              <w:right w:val="nil"/>
-            </w:tcBorders>
-            <w:shd w:val="clear" w:color="000000" w:fill="E3EBF8"/>
-            <w:noWrap/>
-            <w:vAlign w:val="center"/>
-            <w:hideMark/>
-          </w:tcPr>
-          <w:p>
-            <w:pPr>
-              <w:spacing w:after="0" w:line="240" w:lineRule="auto"/>
-              <w:rPr>
-                <w:rFonts w:ascii="Montserrat" w:eastAsia="Times New Roman" w:hAnsi="Montserrat" w:cs="Calibri"/>
-                <w:b/>
-                <w:bCs/>
-                <w:color w:val="007EC5"/>
-                <w:kern w:val="0"/>
-                <w:sz w:val="16"/>
-                <w:szCs w:val="16"/>
-                <w14:ligatures w14:val="none"/>
-              </w:rPr>
-            </w:pPr>
-            <w:r>
-              <w:rPr>
-                <w:rFonts w:ascii="Montserrat" w:eastAsia="Times New Roman" w:hAnsi="Montserrat" w:cs="Calibri"/>
-                <w:b/>
-                <w:bCs/>
-                <w:color w:val="007EC5"/>
-                <w:kern w:val="0"/>
-                <w:sz w:val="16"/>
-                <w:szCs w:val="16"/>
-                <w14:ligatures w14:val="none"/>
-              </w:rPr>
-              <w:t> </w:t>
-            </w:r>
-          </w:p>
-        </w:tc>
-      </w:tr>
-      <w:tr>
-        <w:trPr>
-          <w:trHeight w:val="360"/>
-        </w:trPr>
-        <w:tc>
-          <w:tcPr>
-            <w:tcW w:w="4420" w:type="dxa"/>
-            <w:tcBorders>
-              <w:top w:val="nil"/>
-              <w:left w:val="single" w:sz="4" w:space="0" w:color="auto"/>
-              <w:bottom w:val="single" w:sz="4" w:space="0" w:color="auto"/>
-              <w:right w:val="single" w:sz="4" w:space="0" w:color="auto"/>
-            </w:tcBorders>
-            <w:noWrap/>
-            <w:vAlign w:val="center"/>
-            <w:hideMark/>
-          </w:tcPr>
-          <w:p>
-            <w:pPr>
-              <w:spacing w:after="0" w:line="240" w:lineRule="auto"/>
-              <w:ind w:firstLineChars="100" w:firstLine="160"/>
-              <w:rPr>
-                <w:rFonts w:ascii="Montserrat" w:eastAsia="Times New Roman" w:hAnsi="Montserrat" w:cs="Calibri"/>
-                <w:color w:val="000000"/>
-                <w:kern w:val="0"/>
-                <w:sz w:val="16"/>
-                <w:szCs w:val="16"/>
-                <w14:ligatures w14:val="none"/>
-              </w:rPr>
-            </w:pPr>
-            <w:r>
-              <w:rPr>
-                <w:rFonts w:ascii="Montserrat" w:eastAsia="Times New Roman" w:hAnsi="Montserrat" w:cs="Calibri"/>
-                <w:color w:val="000000"/>
-                <w:kern w:val="0"/>
-                <w:sz w:val="16"/>
-                <w:szCs w:val="16"/>
-                <w14:ligatures w14:val="none"/>
-              </w:rPr>
-              <w:t>Kujdesi gjatë shtatzanisë dhe lindja</w:t>
-            </w:r>
-          </w:p>
-        </w:tc>
-        <w:tc>
-          <w:tcPr>
-            <w:tcW w:w="2055" w:type="dxa"/>
-            <w:tcBorders>
-              <w:top w:val="single" w:sz="4" w:space="0" w:color="auto"/>
-              <w:left w:val="single" w:sz="4" w:space="0" w:color="auto"/>
-              <w:bottom w:val="single" w:sz="4" w:space="0" w:color="auto"/>
-              <w:right w:val="single" w:sz="4" w:space="0" w:color="auto"/>
-            </w:tcBorders>
-            <w:vAlign w:val="bottom"/>
-            <w:hideMark/>
-          </w:tcPr>
-          <w:p>
-            <w:pPr>
-              <w:spacing w:after="0" w:line="240" w:lineRule="auto"/>
-              <w:jc w:val="center"/>
-              <w:rPr>
-                <w:rFonts w:ascii="Montserrat" w:eastAsia="Times New Roman" w:hAnsi="Montserrat" w:cs="Calibri"/>
-                <w:color w:val="000000"/>
-                <w:kern w:val="0"/>
-                <w:sz w:val="16"/>
-                <w:szCs w:val="16"/>
-                <w14:ligatures w14:val="none"/>
-              </w:rPr>
-            </w:pPr>
-            <w:r>
-              <w:rPr>
-                <w:rFonts w:ascii="Montserrat" w:hAnsi="Montserrat" w:cs="Calibri"/>
-                <w:color w:val="000000"/>
-                <w:sz w:val="16"/>
-                <w:szCs w:val="16"/>
-              </w:rPr>
-              <w:t xml:space="preserve">80% deri në </w:t>
-            </w:r>
-            <w:r>
-              <w:rPr>
-                <w:rFonts w:ascii="Montserrat" w:hAnsi="Montserrat" w:cs="Calibri"/>
-                <w:color w:val="000000"/>
-                <w:sz w:val="16"/>
-                <w:szCs w:val="16"/>
-              </w:rPr>
-              <w:t>€ 1.200</w:t>
-            </w:r>
-          </w:p>
-        </w:tc>
-      </w:tr>
-      <w:tr>
-        <w:trPr>
-          <w:trHeight w:val="360"/>
-        </w:trPr>
-        <w:tc>
-          <w:tcPr>
-            <w:tcW w:w="4420" w:type="dxa"/>
-            <w:tcBorders>
-              <w:top w:val="nil"/>
-              <w:left w:val="single" w:sz="4" w:space="0" w:color="auto"/>
-              <w:bottom w:val="single" w:sz="4" w:space="0" w:color="auto"/>
-              <w:right w:val="single" w:sz="4" w:space="0" w:color="auto"/>
-            </w:tcBorders>
-            <w:noWrap/>
-            <w:vAlign w:val="center"/>
-            <w:hideMark/>
-          </w:tcPr>
-          <w:p>
-            <w:pPr>
-              <w:spacing w:after="0" w:line="240" w:lineRule="auto"/>
-              <w:ind w:firstLineChars="100" w:firstLine="160"/>
-              <w:rPr>
-                <w:rFonts w:ascii="Montserrat" w:eastAsia="Times New Roman" w:hAnsi="Montserrat" w:cs="Calibri"/>
-                <w:color w:val="000000"/>
-                <w:kern w:val="0"/>
-                <w:sz w:val="16"/>
-                <w:szCs w:val="16"/>
-                <w14:ligatures w14:val="none"/>
-              </w:rPr>
-            </w:pPr>
-            <w:r>
-              <w:rPr>
-                <w:rFonts w:ascii="Montserrat" w:eastAsia="Times New Roman" w:hAnsi="Montserrat" w:cs="Calibri"/>
-                <w:color w:val="000000"/>
-                <w:kern w:val="0"/>
-                <w:sz w:val="16"/>
-                <w:szCs w:val="16"/>
-                <w14:ligatures w14:val="none"/>
-              </w:rPr>
-              <w:t>Kujdesi dentar</w:t>
-            </w:r>
-          </w:p>
-        </w:tc>
-        <w:tc>
-          <w:tcPr>
-            <w:tcW w:w="2055" w:type="dxa"/>
-            <w:tcBorders>
-              <w:top w:val="nil"/>
-              <w:left w:val="single" w:sz="4" w:space="0" w:color="auto"/>
-              <w:bottom w:val="single" w:sz="4" w:space="0" w:color="auto"/>
-              <w:right w:val="single" w:sz="4" w:space="0" w:color="auto"/>
-            </w:tcBorders>
-            <w:vAlign w:val="bottom"/>
-            <w:hideMark/>
-          </w:tcPr>
-          <w:p>
-            <w:pPr>
-              <w:spacing w:after="0" w:line="240" w:lineRule="auto"/>
-              <w:jc w:val="center"/>
-              <w:rPr>
-                <w:rFonts w:ascii="Montserrat" w:eastAsia="Times New Roman" w:hAnsi="Montserrat" w:cs="Calibri"/>
-                <w:color w:val="000000"/>
-                <w:kern w:val="0"/>
-                <w:sz w:val="16"/>
-                <w:szCs w:val="16"/>
-                <w14:ligatures w14:val="none"/>
-              </w:rPr>
-            </w:pPr>
-            <w:r>
-              <w:rPr>
-                <w:rFonts w:ascii="Montserrat" w:hAnsi="Montserrat" w:cs="Calibri"/>
-                <w:color w:val="000000"/>
-                <w:sz w:val="16"/>
-                <w:szCs w:val="16"/>
-              </w:rPr>
-              <w:t xml:space="preserve">80% deri në </w:t>
-            </w:r>
-            <w:r>
-              <w:rPr>
-                <w:rFonts w:ascii="Montserrat" w:hAnsi="Montserrat" w:cs="Calibri"/>
-                <w:color w:val="000000"/>
-                <w:sz w:val="16"/>
-                <w:szCs w:val="16"/>
-              </w:rPr>
-              <w:t>€ 120</w:t>
-            </w:r>
-          </w:p>
-        </w:tc>
-      </w:tr>
-      <w:tr>
-        <w:trPr>
-          <w:trHeight w:val="360"/>
-        </w:trPr>
-        <w:tc>
-          <w:tcPr>
-            <w:tcW w:w="4420" w:type="dxa"/>
-            <w:tcBorders>
-              <w:top w:val="nil"/>
-              <w:left w:val="single" w:sz="4" w:space="0" w:color="auto"/>
-              <w:bottom w:val="single" w:sz="4" w:space="0" w:color="auto"/>
-              <w:right w:val="single" w:sz="4" w:space="0" w:color="auto"/>
-            </w:tcBorders>
-            <w:noWrap/>
-            <w:vAlign w:val="center"/>
-            <w:hideMark/>
-          </w:tcPr>
-          <w:p>
-            <w:pPr>
-              <w:spacing w:after="0" w:line="240" w:lineRule="auto"/>
-              <w:ind w:firstLineChars="100" w:firstLine="160"/>
-              <w:rPr>
-                <w:rFonts w:ascii="Montserrat" w:eastAsia="Times New Roman" w:hAnsi="Montserrat" w:cs="Calibri"/>
-                <w:color w:val="000000"/>
-                <w:kern w:val="0"/>
-                <w:sz w:val="16"/>
-                <w:szCs w:val="16"/>
-                <w14:ligatures w14:val="none"/>
-              </w:rPr>
-            </w:pPr>
-            <w:r>
-              <w:rPr>
-                <w:rFonts w:ascii="Montserrat" w:eastAsia="Times New Roman" w:hAnsi="Montserrat" w:cs="Calibri"/>
-                <w:color w:val="000000"/>
-                <w:kern w:val="0"/>
-                <w:sz w:val="16"/>
-                <w:szCs w:val="16"/>
-                <w14:ligatures w14:val="none"/>
-              </w:rPr>
-              <w:t>Kujdesi optik</w:t>
-            </w:r>
-          </w:p>
-        </w:tc>
-        <w:tc>
-          <w:tcPr>
-            <w:tcW w:w="2055" w:type="dxa"/>
-            <w:tcBorders>
-              <w:top w:val="nil"/>
-              <w:left w:val="single" w:sz="4" w:space="0" w:color="auto"/>
-              <w:bottom w:val="single" w:sz="4" w:space="0" w:color="auto"/>
-              <w:right w:val="single" w:sz="4" w:space="0" w:color="auto"/>
-            </w:tcBorders>
-            <w:vAlign w:val="bottom"/>
-            <w:hideMark/>
-          </w:tcPr>
-          <w:p>
-            <w:pPr>
-              <w:spacing w:after="0" w:line="240" w:lineRule="auto"/>
-              <w:jc w:val="center"/>
-              <w:rPr>
-                <w:rFonts w:ascii="Montserrat" w:eastAsia="Times New Roman" w:hAnsi="Montserrat" w:cs="Calibri"/>
-                <w:color w:val="000000"/>
-                <w:kern w:val="0"/>
-                <w:sz w:val="16"/>
-                <w:szCs w:val="16"/>
-                <w14:ligatures w14:val="none"/>
-              </w:rPr>
-            </w:pPr>
-            <w:r>
-              <w:rPr>
-                <w:rFonts w:ascii="Montserrat" w:hAnsi="Montserrat" w:cs="Calibri"/>
-                <w:color w:val="000000"/>
-                <w:sz w:val="16"/>
-                <w:szCs w:val="16"/>
-              </w:rPr>
-              <w:t xml:space="preserve">80% deri në </w:t>
-            </w:r>
-            <w:r>
-              <w:rPr>
-                <w:rFonts w:ascii="Montserrat" w:hAnsi="Montserrat" w:cs="Calibri"/>
-                <w:color w:val="000000"/>
-                <w:sz w:val="16"/>
-                <w:szCs w:val="16"/>
-              </w:rPr>
-              <w:t>€ 80</w:t>
-            </w:r>
-          </w:p>
-        </w:tc>
-      </w:tr>
-      <w:tr>
-        <w:trPr>
-          <w:trHeight w:val="360"/>
-        </w:trPr>
-        <w:tc>
-          <w:tcPr>
-            <w:tcW w:w="4420" w:type="dxa"/>
-            <w:tcBorders>
-              <w:top w:val="nil"/>
-              <w:left w:val="single" w:sz="4" w:space="0" w:color="auto"/>
-              <w:bottom w:val="single" w:sz="4" w:space="0" w:color="auto"/>
-              <w:right w:val="single" w:sz="4" w:space="0" w:color="auto"/>
-            </w:tcBorders>
-            <w:noWrap/>
-            <w:vAlign w:val="center"/>
-            <w:hideMark/>
-          </w:tcPr>
-          <w:p>
-            <w:pPr>
-              <w:spacing w:after="0" w:line="240" w:lineRule="auto"/>
-              <w:ind w:firstLineChars="100" w:firstLine="160"/>
-              <w:rPr>
-                <w:rFonts w:ascii="Montserrat" w:eastAsia="Times New Roman" w:hAnsi="Montserrat" w:cs="Calibri"/>
-                <w:color w:val="000000"/>
-                <w:kern w:val="0"/>
-                <w:sz w:val="16"/>
-                <w:szCs w:val="16"/>
-                <w14:ligatures w14:val="none"/>
-              </w:rPr>
-            </w:pPr>
-            <w:r>
-              <w:rPr>
-                <w:rFonts w:ascii="Montserrat" w:eastAsia="Times New Roman" w:hAnsi="Montserrat" w:cs="Calibri"/>
-                <w:color w:val="000000"/>
-                <w:kern w:val="0"/>
-                <w:sz w:val="16"/>
-                <w:szCs w:val="16"/>
-                <w14:ligatures w14:val="none"/>
-              </w:rPr>
-              <w:t>Kujdesi për dëgjim</w:t>
-            </w:r>
-          </w:p>
-        </w:tc>
-        <w:tc>
-          <w:tcPr>
-            <w:tcW w:w="2055" w:type="dxa"/>
-            <w:tcBorders>
-              <w:top w:val="nil"/>
-              <w:left w:val="single" w:sz="4" w:space="0" w:color="auto"/>
-              <w:bottom w:val="single" w:sz="4" w:space="0" w:color="auto"/>
-              <w:right w:val="single" w:sz="4" w:space="0" w:color="auto"/>
-            </w:tcBorders>
-            <w:vAlign w:val="bottom"/>
-            <w:hideMark/>
-          </w:tcPr>
-          <w:p>
-            <w:pPr>
-              <w:spacing w:after="0" w:line="240" w:lineRule="auto"/>
-              <w:jc w:val="center"/>
-              <w:rPr>
-                <w:rFonts w:ascii="Montserrat" w:eastAsia="Times New Roman" w:hAnsi="Montserrat" w:cs="Calibri"/>
-                <w:color w:val="000000"/>
-                <w:kern w:val="0"/>
-                <w:sz w:val="16"/>
-                <w:szCs w:val="16"/>
-                <w14:ligatures w14:val="none"/>
-              </w:rPr>
-            </w:pPr>
-            <w:r>
-              <w:rPr>
-                <w:rFonts w:ascii="Montserrat" w:hAnsi="Montserrat" w:cs="Calibri"/>
-                <w:color w:val="000000"/>
-                <w:sz w:val="16"/>
-                <w:szCs w:val="16"/>
-              </w:rPr>
-              <w:t>80% deri në € 120</w:t>
-            </w:r>
-          </w:p>
-        </w:tc>
-      </w:tr>
-      <w:tr>
-        <w:trPr>
-          <w:trHeight w:val="360"/>
-        </w:trPr>
-        <w:tc>
-          <w:tcPr>
-            <w:tcW w:w="4420" w:type="dxa"/>
-            <w:tcBorders>
-              <w:top w:val="nil"/>
-              <w:left w:val="single" w:sz="4" w:space="0" w:color="auto"/>
-              <w:bottom w:val="single" w:sz="4" w:space="0" w:color="auto"/>
-              <w:right w:val="single" w:sz="4" w:space="0" w:color="auto"/>
-            </w:tcBorders>
-            <w:noWrap/>
-            <w:vAlign w:val="center"/>
-            <w:hideMark/>
-          </w:tcPr>
-          <w:p>
-            <w:pPr>
-              <w:spacing w:after="0" w:line="240" w:lineRule="auto"/>
-              <w:ind w:firstLineChars="100" w:firstLine="160"/>
-              <w:rPr>
-                <w:rFonts w:ascii="Montserrat" w:eastAsia="Times New Roman" w:hAnsi="Montserrat" w:cs="Calibri"/>
-                <w:color w:val="000000"/>
-                <w:kern w:val="0"/>
-                <w:sz w:val="16"/>
-                <w:szCs w:val="16"/>
-                <w14:ligatures w14:val="none"/>
-              </w:rPr>
-            </w:pPr>
-            <w:r>
-              <w:rPr>
-                <w:rFonts w:ascii="Montserrat" w:eastAsia="Times New Roman" w:hAnsi="Montserrat" w:cs="Calibri"/>
-                <w:color w:val="000000"/>
-                <w:kern w:val="0"/>
-                <w:sz w:val="16"/>
-                <w:szCs w:val="16"/>
-                <w14:ligatures w14:val="none"/>
-              </w:rPr>
-              <w:t>Kujdesi psikiatrik</w:t>
-            </w:r>
-          </w:p>
-        </w:tc>
-        <w:tc>
-          <w:tcPr>
-            <w:tcW w:w="2055" w:type="dxa"/>
-            <w:tcBorders>
-              <w:top w:val="nil"/>
-              <w:left w:val="single" w:sz="4" w:space="0" w:color="auto"/>
-              <w:bottom w:val="single" w:sz="4" w:space="0" w:color="auto"/>
-              <w:right w:val="single" w:sz="4" w:space="0" w:color="auto"/>
-            </w:tcBorders>
-            <w:vAlign w:val="bottom"/>
-            <w:hideMark/>
-          </w:tcPr>
-          <w:p>
-            <w:pPr>
-              <w:spacing w:after="0" w:line="240" w:lineRule="auto"/>
-              <w:jc w:val="center"/>
-              <w:rPr>
-                <w:rFonts w:ascii="Montserrat" w:eastAsia="Times New Roman" w:hAnsi="Montserrat" w:cs="Calibri"/>
-                <w:color w:val="000000"/>
-                <w:kern w:val="0"/>
-                <w:sz w:val="16"/>
-                <w:szCs w:val="16"/>
-                <w14:ligatures w14:val="none"/>
-              </w:rPr>
-            </w:pPr>
-            <w:r>
-              <w:rPr>
-                <w:rFonts w:ascii="Montserrat" w:hAnsi="Montserrat" w:cs="Calibri"/>
-                <w:color w:val="000000"/>
-                <w:sz w:val="16"/>
-                <w:szCs w:val="16"/>
-              </w:rPr>
-              <w:t>80% deri në € 120</w:t>
-            </w:r>
-          </w:p>
-        </w:tc>
-      </w:tr>
-      <w:tr>
-        <w:trPr>
-          <w:trHeight w:val="360"/>
-        </w:trPr>
-        <w:tc>
-          <w:tcPr>
-            <w:tcW w:w="4420" w:type="dxa"/>
-            <w:tcBorders>
-              <w:top w:val="nil"/>
-              <w:left w:val="single" w:sz="4" w:space="0" w:color="auto"/>
-              <w:bottom w:val="single" w:sz="4" w:space="0" w:color="auto"/>
-              <w:right w:val="single" w:sz="4" w:space="0" w:color="auto"/>
-            </w:tcBorders>
-            <w:noWrap/>
-            <w:vAlign w:val="center"/>
-            <w:hideMark/>
-          </w:tcPr>
-          <w:p>
-            <w:pPr>
-              <w:spacing w:after="0" w:line="240" w:lineRule="auto"/>
-              <w:ind w:firstLineChars="100" w:firstLine="160"/>
-              <w:rPr>
-                <w:rFonts w:ascii="Montserrat" w:eastAsia="Times New Roman" w:hAnsi="Montserrat" w:cs="Calibri"/>
-                <w:color w:val="000000"/>
-                <w:kern w:val="0"/>
-                <w:sz w:val="16"/>
-                <w:szCs w:val="16"/>
-                <w14:ligatures w14:val="none"/>
-              </w:rPr>
-            </w:pPr>
-            <w:r>
-              <w:rPr>
-                <w:rFonts w:ascii="Montserrat" w:eastAsia="Times New Roman" w:hAnsi="Montserrat" w:cs="Calibri"/>
-                <w:color w:val="000000"/>
-                <w:kern w:val="0"/>
-                <w:sz w:val="16"/>
-                <w:szCs w:val="16"/>
-                <w14:ligatures w14:val="none"/>
-              </w:rPr>
-              <w:t>Fizioterapia</w:t>
-            </w:r>
-          </w:p>
-        </w:tc>
-        <w:tc>
-          <w:tcPr>
-            <w:tcW w:w="2055" w:type="dxa"/>
-            <w:tcBorders>
-              <w:top w:val="nil"/>
-              <w:left w:val="single" w:sz="4" w:space="0" w:color="auto"/>
-              <w:bottom w:val="single" w:sz="4" w:space="0" w:color="auto"/>
-              <w:right w:val="single" w:sz="4" w:space="0" w:color="auto"/>
-            </w:tcBorders>
-            <w:vAlign w:val="bottom"/>
-            <w:hideMark/>
-          </w:tcPr>
-          <w:p>
-            <w:pPr>
-              <w:spacing w:after="0" w:line="240" w:lineRule="auto"/>
-              <w:jc w:val="center"/>
-              <w:rPr>
-                <w:rFonts w:ascii="Montserrat" w:eastAsia="Times New Roman" w:hAnsi="Montserrat" w:cs="Calibri"/>
-                <w:color w:val="000000"/>
-                <w:kern w:val="0"/>
-                <w:sz w:val="16"/>
-                <w:szCs w:val="16"/>
-                <w14:ligatures w14:val="none"/>
-              </w:rPr>
-            </w:pPr>
-            <w:r>
-              <w:rPr>
-                <w:rFonts w:ascii="Montserrat" w:hAnsi="Montserrat" w:cs="Calibri"/>
-                <w:color w:val="000000"/>
-                <w:sz w:val="16"/>
-                <w:szCs w:val="16"/>
-              </w:rPr>
-              <w:t>80% deri në € 100</w:t>
-            </w:r>
-          </w:p>
-        </w:tc>
-      </w:tr>
-      <w:tr>
-        <w:trPr>
-          <w:trHeight w:val="360"/>
-        </w:trPr>
-        <w:tc>
-          <w:tcPr>
-            <w:tcW w:w="4420" w:type="dxa"/>
-            <w:tcBorders>
-              <w:top w:val="nil"/>
-              <w:left w:val="single" w:sz="4" w:space="0" w:color="auto"/>
-              <w:bottom w:val="single" w:sz="4" w:space="0" w:color="auto"/>
-              <w:right w:val="single" w:sz="4" w:space="0" w:color="auto"/>
-            </w:tcBorders>
-            <w:noWrap/>
-            <w:vAlign w:val="center"/>
-            <w:hideMark/>
-          </w:tcPr>
-          <w:p>
-            <w:pPr>
-              <w:spacing w:after="0" w:line="240" w:lineRule="auto"/>
-              <w:ind w:firstLineChars="100" w:firstLine="160"/>
-              <w:rPr>
-                <w:rFonts w:ascii="Montserrat" w:eastAsia="Times New Roman" w:hAnsi="Montserrat" w:cs="Calibri"/>
-                <w:color w:val="000000"/>
-                <w:kern w:val="0"/>
-                <w:sz w:val="16"/>
-                <w:szCs w:val="16"/>
-                <w14:ligatures w14:val="none"/>
-              </w:rPr>
-            </w:pPr>
-            <w:r>
-              <w:rPr>
-                <w:rFonts w:ascii="Montserrat" w:eastAsia="Times New Roman" w:hAnsi="Montserrat" w:cs="Calibri"/>
-                <w:color w:val="000000"/>
-                <w:kern w:val="0"/>
-                <w:sz w:val="16"/>
-                <w:szCs w:val="16"/>
-                <w14:ligatures w14:val="none"/>
-              </w:rPr>
-              <w:t>Autoambulanca brenda dhe jashtë Kosovës</w:t>
-            </w:r>
-          </w:p>
-        </w:tc>
-        <w:tc>
-          <w:tcPr>
-            <w:tcW w:w="2055" w:type="dxa"/>
-            <w:tcBorders>
-              <w:top w:val="nil"/>
-              <w:left w:val="single" w:sz="4" w:space="0" w:color="auto"/>
-              <w:bottom w:val="single" w:sz="4" w:space="0" w:color="auto"/>
-              <w:right w:val="single" w:sz="4" w:space="0" w:color="auto"/>
-            </w:tcBorders>
-            <w:noWrap/>
-            <w:vAlign w:val="bottom"/>
-            <w:hideMark/>
-          </w:tcPr>
-          <w:p>
-            <w:pPr>
-              <w:spacing w:after="0" w:line="240" w:lineRule="auto"/>
-              <w:jc w:val="center"/>
-              <w:rPr>
-                <w:rFonts w:ascii="Montserrat" w:eastAsia="Times New Roman" w:hAnsi="Montserrat" w:cs="Calibri"/>
-                <w:color w:val="000000"/>
-                <w:kern w:val="0"/>
-                <w:sz w:val="16"/>
-                <w:szCs w:val="16"/>
-                <w14:ligatures w14:val="none"/>
-              </w:rPr>
-            </w:pPr>
-            <w:r>
-              <w:rPr>
-                <w:rFonts w:ascii="Montserrat" w:hAnsi="Montserrat" w:cs="Calibri"/>
-                <w:color w:val="000000"/>
-                <w:sz w:val="16"/>
-                <w:szCs w:val="16"/>
-              </w:rPr>
-              <w:t>100% deri në € 200</w:t>
-            </w:r>
-          </w:p>
-        </w:tc>
-      </w:tr>
-      <w:tr>
-        <w:trPr>
-          <w:trHeight w:val="360"/>
-        </w:trPr>
-        <w:tc>
-          <w:tcPr>
-            <w:tcW w:w="4420" w:type="dxa"/>
-            <w:tcBorders>
-              <w:top w:val="nil"/>
-              <w:left w:val="single" w:sz="4" w:space="0" w:color="auto"/>
-              <w:bottom w:val="single" w:sz="4" w:space="0" w:color="auto"/>
-              <w:right w:val="single" w:sz="4" w:space="0" w:color="auto"/>
-            </w:tcBorders>
-            <w:noWrap/>
-            <w:vAlign w:val="center"/>
-            <w:hideMark/>
-          </w:tcPr>
-          <w:p>
-            <w:pPr>
-              <w:spacing w:after="0" w:line="240" w:lineRule="auto"/>
-              <w:ind w:firstLineChars="100" w:firstLine="160"/>
-              <w:rPr>
-                <w:rFonts w:ascii="Montserrat" w:eastAsia="Times New Roman" w:hAnsi="Montserrat" w:cs="Calibri"/>
-                <w:color w:val="000000"/>
-                <w:kern w:val="0"/>
-                <w:sz w:val="16"/>
-                <w:szCs w:val="16"/>
-                <w14:ligatures w14:val="none"/>
-              </w:rPr>
-            </w:pPr>
-            <w:r>
-              <w:rPr>
-                <w:rFonts w:ascii="Montserrat" w:eastAsia="Times New Roman" w:hAnsi="Montserrat" w:cs="Calibri"/>
-                <w:color w:val="000000"/>
-                <w:kern w:val="0"/>
-                <w:sz w:val="16"/>
-                <w:szCs w:val="16"/>
-                <w14:ligatures w14:val="none"/>
-              </w:rPr>
-              <w:t>Shpenzimet e mjekimit si pasojë e aksidentit</w:t>
-            </w:r>
-          </w:p>
-        </w:tc>
-        <w:tc>
-          <w:tcPr>
-            <w:tcW w:w="2055" w:type="dxa"/>
-            <w:tcBorders>
-              <w:top w:val="nil"/>
-              <w:left w:val="single" w:sz="4" w:space="0" w:color="auto"/>
-              <w:bottom w:val="single" w:sz="4" w:space="0" w:color="auto"/>
-              <w:right w:val="single" w:sz="4" w:space="0" w:color="auto"/>
-            </w:tcBorders>
-            <w:noWrap/>
-            <w:vAlign w:val="bottom"/>
-            <w:hideMark/>
-          </w:tcPr>
-          <w:p>
-            <w:pPr>
-              <w:spacing w:after="0" w:line="240" w:lineRule="auto"/>
-              <w:jc w:val="center"/>
-              <w:rPr>
-                <w:rFonts w:ascii="Montserrat" w:eastAsia="Times New Roman" w:hAnsi="Montserrat" w:cs="Calibri"/>
-                <w:color w:val="000000"/>
-                <w:kern w:val="0"/>
-                <w:sz w:val="16"/>
-                <w:szCs w:val="16"/>
-                <w14:ligatures w14:val="none"/>
-              </w:rPr>
-            </w:pPr>
-            <w:r>
-              <w:rPr>
-                <w:rFonts w:ascii="Montserrat" w:hAnsi="Montserrat" w:cs="Calibri"/>
-                <w:color w:val="000000"/>
-                <w:sz w:val="16"/>
-                <w:szCs w:val="16"/>
-              </w:rPr>
-              <w:t>100% deri në € 20.000</w:t>
-            </w:r>
-          </w:p>
-        </w:tc>
-      </w:tr>
-      <w:tr>
-        <w:trPr>
-          <w:trHeight w:val="360"/>
-        </w:trPr>
-        <w:tc>
-          <w:tcPr>
-            <w:tcW w:w="4420" w:type="dxa"/>
-            <w:tcBorders>
-              <w:top w:val="nil"/>
-              <w:left w:val="single" w:sz="4" w:space="0" w:color="auto"/>
-              <w:bottom w:val="single" w:sz="4" w:space="0" w:color="auto"/>
-              <w:right w:val="single" w:sz="4" w:space="0" w:color="auto"/>
-            </w:tcBorders>
-            <w:noWrap/>
-            <w:vAlign w:val="center"/>
-            <w:hideMark/>
-          </w:tcPr>
-          <w:p>
-            <w:pPr>
-              <w:spacing w:after="0" w:line="240" w:lineRule="auto"/>
-              <w:ind w:firstLineChars="100" w:firstLine="160"/>
-              <w:rPr>
-                <w:rFonts w:ascii="Montserrat" w:eastAsia="Times New Roman" w:hAnsi="Montserrat" w:cs="Calibri"/>
-                <w:color w:val="000000"/>
-                <w:kern w:val="0"/>
-                <w:sz w:val="16"/>
-                <w:szCs w:val="16"/>
-                <w14:ligatures w14:val="none"/>
-              </w:rPr>
-            </w:pPr>
-            <w:r>
-              <w:rPr>
-                <w:rFonts w:ascii="Montserrat" w:eastAsia="Times New Roman" w:hAnsi="Montserrat" w:cs="Calibri"/>
-                <w:color w:val="000000"/>
-                <w:kern w:val="0"/>
-                <w:sz w:val="16"/>
-                <w:szCs w:val="16"/>
-                <w14:ligatures w14:val="none"/>
-              </w:rPr>
-              <w:t>Trajtimet onkologjike</w:t>
-            </w:r>
-          </w:p>
-        </w:tc>
-        <w:tc>
-          <w:tcPr>
-            <w:tcW w:w="2055" w:type="dxa"/>
-            <w:tcBorders>
-              <w:top w:val="nil"/>
-              <w:left w:val="single" w:sz="4" w:space="0" w:color="auto"/>
-              <w:bottom w:val="single" w:sz="4" w:space="0" w:color="auto"/>
-              <w:right w:val="single" w:sz="4" w:space="0" w:color="auto"/>
-            </w:tcBorders>
-            <w:noWrap/>
-            <w:vAlign w:val="bottom"/>
-            <w:hideMark/>
-          </w:tcPr>
-          <w:p>
-            <w:pPr>
-              <w:spacing w:after="0" w:line="240" w:lineRule="auto"/>
-              <w:jc w:val="center"/>
-              <w:rPr>
-                <w:rFonts w:ascii="Montserrat" w:eastAsia="Times New Roman" w:hAnsi="Montserrat" w:cs="Calibri"/>
-                <w:color w:val="000000"/>
-                <w:kern w:val="0"/>
-                <w:sz w:val="16"/>
-                <w:szCs w:val="16"/>
-                <w14:ligatures w14:val="none"/>
-              </w:rPr>
-            </w:pPr>
-            <w:r>
-              <w:rPr>
-                <w:rFonts w:ascii="Montserrat" w:hAnsi="Montserrat" w:cs="Calibri"/>
-                <w:color w:val="000000"/>
-                <w:sz w:val="16"/>
-                <w:szCs w:val="16"/>
-              </w:rPr>
-              <w:t>100% deri në € 20.000</w:t>
-            </w:r>
-          </w:p>
-        </w:tc>
-      </w:tr>
-      <w:tr>
-        <w:trPr>
-          <w:trHeight w:val="402"/>
-        </w:trPr>
-        <w:tc>
-          <w:tcPr>
-            <w:tcW w:w="4420" w:type="dxa"/>
-            <w:tcBorders>
-              <w:top w:val="nil"/>
-              <w:left w:val="single" w:sz="4" w:space="0" w:color="auto"/>
-              <w:bottom w:val="single" w:sz="4" w:space="0" w:color="auto"/>
-              <w:right w:val="single" w:sz="4" w:space="0" w:color="auto"/>
-            </w:tcBorders>
-            <w:shd w:val="clear" w:color="000000" w:fill="E3EBF8"/>
-            <w:noWrap/>
-            <w:vAlign w:val="center"/>
-            <w:hideMark/>
-          </w:tcPr>
-          <w:p>
-            <w:pPr>
-              <w:spacing w:after="0" w:line="240" w:lineRule="auto"/>
-              <w:ind w:firstLineChars="100" w:firstLine="161"/>
-              <w:rPr>
-                <w:rFonts w:ascii="Montserrat" w:eastAsia="Times New Roman" w:hAnsi="Montserrat" w:cs="Calibri"/>
-                <w:b/>
-                <w:bCs/>
-                <w:color w:val="007EC5"/>
-                <w:kern w:val="0"/>
-                <w:sz w:val="16"/>
-                <w:szCs w:val="16"/>
-                <w14:ligatures w14:val="none"/>
-              </w:rPr>
-            </w:pPr>
-            <w:r>
-              <w:rPr>
-                <w:rFonts w:ascii="Montserrat" w:eastAsia="Times New Roman" w:hAnsi="Montserrat" w:cs="Calibri"/>
-                <w:b/>
-                <w:bCs/>
-                <w:color w:val="007EC5"/>
-                <w:kern w:val="0"/>
-                <w:sz w:val="16"/>
-                <w:szCs w:val="16"/>
-                <w14:ligatures w14:val="none"/>
-              </w:rPr>
-              <w:t xml:space="preserve">Primet mujore </w:t>
-            </w:r>
-          </w:p>
-        </w:tc>
-        <w:tc>
-          <w:tcPr>
-            <w:tcW w:w="2055" w:type="dxa"/>
-            <w:tcBorders>
-              <w:top w:val="single" w:sz="4" w:space="0" w:color="auto"/>
-              <w:left w:val="single" w:sz="4" w:space="0" w:color="auto"/>
-              <w:bottom w:val="single" w:sz="4" w:space="0" w:color="auto"/>
-              <w:right w:val="single" w:sz="4" w:space="0" w:color="auto"/>
-            </w:tcBorders>
-            <w:shd w:val="clear" w:color="000000" w:fill="E3EBF8"/>
-            <w:noWrap/>
-            <w:vAlign w:val="center"/>
-            <w:hideMark/>
-          </w:tcPr>
-          <w:p>
-            <w:pPr>
-              <w:spacing w:after="0" w:line="240" w:lineRule="auto"/>
-              <w:jc w:val="center"/>
-              <w:rPr>
-                <w:rFonts w:ascii="Montserrat" w:eastAsia="Times New Roman" w:hAnsi="Montserrat" w:cs="Calibri"/>
-                <w:b/>
-                <w:bCs/>
-                <w:color w:val="007EC5"/>
-                <w:kern w:val="0"/>
-                <w:sz w:val="16"/>
+                <w:sz w:val="20"/>
                 <w:szCs w:val="16"/>
                 <w14:ligatures w14:val="none"/>
               </w:rPr>
@@ -2384,7 +2002,7 @@
                 <w:b/>
                 <w:bCs/>
                 <w:color w:val="007EC5"/>
-                <w:sz w:val="16"/>
+                <w:sz w:val="20"/>
                 <w:szCs w:val="16"/>
               </w:rPr>
               <w:t>Premium</w:t>
@@ -2394,17 +2012,11 @@
       </w:tr>
       <w:tr>
         <w:trPr>
-          <w:trHeight w:val="360"/>
+          <w:trHeight w:val="20"/>
         </w:trPr>
         <w:tc>
           <w:tcPr>
             <w:tcW w:w="4420" w:type="dxa"/>
-            <w:tcBorders>
-              <w:top w:val="nil"/>
-              <w:left w:val="single" w:sz="4" w:space="0" w:color="auto"/>
-              <w:bottom w:val="single" w:sz="4" w:space="0" w:color="auto"/>
-              <w:right w:val="single" w:sz="4" w:space="0" w:color="auto"/>
-            </w:tcBorders>
             <w:noWrap/>
             <w:vAlign w:val="center"/>
             <w:hideMark/>
@@ -2412,22 +2024,22 @@
           <w:p>
             <w:pPr>
               <w:spacing w:after="0" w:line="240" w:lineRule="auto"/>
-              <w:ind w:firstLineChars="100" w:firstLine="160"/>
-              <w:rPr>
-                <w:rFonts w:ascii="Montserrat" w:eastAsia="Times New Roman" w:hAnsi="Montserrat" w:cs="Calibri"/>
-                <w:color w:val="000000"/>
-                <w:kern w:val="0"/>
-                <w:sz w:val="16"/>
-                <w:szCs w:val="16"/>
-                <w14:ligatures w14:val="none"/>
-              </w:rPr>
-            </w:pPr>
-            <w:r>
-              <w:rPr>
-                <w:rFonts w:ascii="Montserrat" w:eastAsia="Times New Roman" w:hAnsi="Montserrat" w:cs="Calibri"/>
-                <w:color w:val="000000"/>
-                <w:kern w:val="0"/>
-                <w:sz w:val="16"/>
+              <w:ind w:firstLineChars="100" w:firstLine="200"/>
+              <w:rPr>
+                <w:rFonts w:ascii="Montserrat" w:eastAsia="Times New Roman" w:hAnsi="Montserrat" w:cs="Calibri"/>
+                <w:color w:val="000000"/>
+                <w:kern w:val="0"/>
+                <w:sz w:val="20"/>
+                <w:szCs w:val="16"/>
+                <w14:ligatures w14:val="none"/>
+              </w:rPr>
+            </w:pPr>
+            <w:r>
+              <w:rPr>
+                <w:rFonts w:ascii="Montserrat" w:eastAsia="Times New Roman" w:hAnsi="Montserrat" w:cs="Calibri"/>
+                <w:color w:val="000000"/>
+                <w:kern w:val="0"/>
+                <w:sz w:val="20"/>
                 <w:szCs w:val="16"/>
                 <w14:ligatures w14:val="none"/>
               </w:rPr>
@@ -2437,13 +2049,7 @@
         </w:tc>
         <w:tc>
           <w:tcPr>
-            <w:tcW w:w="2055" w:type="dxa"/>
-            <w:tcBorders>
-              <w:top w:val="nil"/>
-              <w:left w:val="single" w:sz="4" w:space="0" w:color="auto"/>
-              <w:bottom w:val="single" w:sz="4" w:space="0" w:color="auto"/>
-              <w:right w:val="single" w:sz="4" w:space="0" w:color="auto"/>
-            </w:tcBorders>
+            <w:tcW w:w="6195" w:type="dxa"/>
             <w:noWrap/>
             <w:vAlign w:val="center"/>
             <w:hideMark/>
@@ -2456,7 +2062,7 @@
                 <w:rFonts w:ascii="Montserrat" w:eastAsia="Times New Roman" w:hAnsi="Montserrat" w:cs="Calibri"/>
                 <w:color w:val="000000"/>
                 <w:kern w:val="0"/>
-                <w:sz w:val="16"/>
+                <w:sz w:val="20"/>
                 <w:szCs w:val="16"/>
                 <w14:ligatures w14:val="none"/>
               </w:rPr>
@@ -2465,7 +2071,7 @@
               <w:rPr>
                 <w:rFonts w:ascii="Montserrat" w:hAnsi="Montserrat" w:cs="Calibri"/>
                 <w:color w:val="000000"/>
-                <w:sz w:val="16"/>
+                <w:sz w:val="20"/>
                 <w:szCs w:val="16"/>
               </w:rPr>
               <w:t>€ 35.00</w:t>
@@ -2475,17 +2081,11 @@
       </w:tr>
       <w:tr>
         <w:trPr>
-          <w:trHeight w:val="360"/>
+          <w:trHeight w:val="20"/>
         </w:trPr>
         <w:tc>
           <w:tcPr>
             <w:tcW w:w="4420" w:type="dxa"/>
-            <w:tcBorders>
-              <w:top w:val="nil"/>
-              <w:left w:val="single" w:sz="4" w:space="0" w:color="auto"/>
-              <w:bottom w:val="single" w:sz="4" w:space="0" w:color="auto"/>
-              <w:right w:val="single" w:sz="4" w:space="0" w:color="auto"/>
-            </w:tcBorders>
             <w:noWrap/>
             <w:vAlign w:val="center"/>
             <w:hideMark/>
@@ -2493,22 +2093,22 @@
           <w:p>
             <w:pPr>
               <w:spacing w:after="0" w:line="240" w:lineRule="auto"/>
-              <w:ind w:firstLineChars="100" w:firstLine="160"/>
-              <w:rPr>
-                <w:rFonts w:ascii="Montserrat" w:eastAsia="Times New Roman" w:hAnsi="Montserrat" w:cs="Calibri"/>
-                <w:color w:val="000000"/>
-                <w:kern w:val="0"/>
-                <w:sz w:val="16"/>
-                <w:szCs w:val="16"/>
-                <w14:ligatures w14:val="none"/>
-              </w:rPr>
-            </w:pPr>
-            <w:r>
-              <w:rPr>
-                <w:rFonts w:ascii="Montserrat" w:eastAsia="Times New Roman" w:hAnsi="Montserrat" w:cs="Calibri"/>
-                <w:color w:val="000000"/>
-                <w:kern w:val="0"/>
-                <w:sz w:val="16"/>
+              <w:ind w:firstLineChars="100" w:firstLine="200"/>
+              <w:rPr>
+                <w:rFonts w:ascii="Montserrat" w:eastAsia="Times New Roman" w:hAnsi="Montserrat" w:cs="Calibri"/>
+                <w:color w:val="000000"/>
+                <w:kern w:val="0"/>
+                <w:sz w:val="20"/>
+                <w:szCs w:val="16"/>
+                <w14:ligatures w14:val="none"/>
+              </w:rPr>
+            </w:pPr>
+            <w:r>
+              <w:rPr>
+                <w:rFonts w:ascii="Montserrat" w:eastAsia="Times New Roman" w:hAnsi="Montserrat" w:cs="Calibri"/>
+                <w:color w:val="000000"/>
+                <w:kern w:val="0"/>
+                <w:sz w:val="20"/>
                 <w:szCs w:val="16"/>
                 <w14:ligatures w14:val="none"/>
               </w:rPr>
@@ -2518,13 +2118,7 @@
         </w:tc>
         <w:tc>
           <w:tcPr>
-            <w:tcW w:w="2055" w:type="dxa"/>
-            <w:tcBorders>
-              <w:top w:val="nil"/>
-              <w:left w:val="single" w:sz="4" w:space="0" w:color="auto"/>
-              <w:bottom w:val="single" w:sz="4" w:space="0" w:color="auto"/>
-              <w:right w:val="single" w:sz="4" w:space="0" w:color="auto"/>
-            </w:tcBorders>
+            <w:tcW w:w="6195" w:type="dxa"/>
             <w:noWrap/>
             <w:vAlign w:val="center"/>
             <w:hideMark/>
@@ -2537,7 +2131,7 @@
                 <w:rFonts w:ascii="Montserrat" w:eastAsia="Times New Roman" w:hAnsi="Montserrat" w:cs="Calibri"/>
                 <w:color w:val="000000"/>
                 <w:kern w:val="0"/>
-                <w:sz w:val="16"/>
+                <w:sz w:val="20"/>
                 <w:szCs w:val="16"/>
                 <w14:ligatures w14:val="none"/>
               </w:rPr>
@@ -2546,7 +2140,7 @@
               <w:rPr>
                 <w:rFonts w:ascii="Montserrat" w:hAnsi="Montserrat" w:cs="Calibri"/>
                 <w:color w:val="000000"/>
-                <w:sz w:val="16"/>
+                <w:sz w:val="20"/>
                 <w:szCs w:val="16"/>
               </w:rPr>
               <w:t>€ 32.00</w:t>
@@ -2574,29 +2168,7 @@
           <w:szCs w:val="16"/>
           <w14:ligatures w14:val="none"/>
         </w:rPr>
-        <w:t>*Nëse shërbimet në kuadër të shtrimit në spital merren në spital publik pa pagesë, I siguruari do të dëmshpërblehet 50% të shpenzimeve sikur shërbimet të ishin marrë në spital privat (Premium: deri në 500€; Silver: deri në 1.000€; Gold: deri në 2.000€).</w:t>
-      </w:r>
-    </w:p>
-    <w:p>
-      <w:pPr>
-        <w:spacing w:after="0" w:line="240" w:lineRule="auto"/>
-        <w:rPr>
-          <w:rFonts w:ascii="Montserrat" w:eastAsia="Times New Roman" w:hAnsi="Montserrat" w:cs="Calibri"/>
-          <w:kern w:val="0"/>
-          <w:sz w:val="16"/>
-          <w:szCs w:val="16"/>
-          <w14:ligatures w14:val="none"/>
-        </w:rPr>
-      </w:pPr>
-      <w:r>
-        <w:rPr>
-          <w:rFonts w:ascii="Montserrat" w:eastAsia="Times New Roman" w:hAnsi="Montserrat" w:cs="Calibri"/>
-          <w:kern w:val="0"/>
-          <w:sz w:val="16"/>
-          <w:szCs w:val="16"/>
-          <w14:ligatures w14:val="none"/>
-        </w:rPr>
-        <w:t>*Nëse shërbimet në kuadër të kujdesit gjatë shtatzanisë dhe lindja merren në spital publik pa pagesë, e siguruara do të dëmshpërblehet 300€ (Vetëm pakot: Standard Plus, Premium, Silver, dhe Gold).</w:t>
+        <w:t>*Nëse shërbimet në kuadër të shtrimit në spital merren në spital publik pa pagesë, I siguruari do të dëmshpërblehet 50%</w:t>
       </w:r>
       <w:r>
         <w:rPr>
@@ -2606,8 +2178,72 @@
           <w:szCs w:val="16"/>
           <w14:ligatures w14:val="none"/>
         </w:rPr>
-        <w:tab/>
+        <w:t xml:space="preserve"> </w:t>
       </w:r>
+      <w:r>
+        <w:rPr>
+          <w:rFonts w:ascii="Montserrat" w:eastAsia="Times New Roman" w:hAnsi="Montserrat" w:cs="Calibri"/>
+          <w:kern w:val="0"/>
+          <w:sz w:val="16"/>
+          <w:szCs w:val="16"/>
+          <w14:ligatures w14:val="none"/>
+        </w:rPr>
+        <w:t>deri në 500€</w:t>
+      </w:r>
+      <w:r>
+        <w:rPr>
+          <w:rFonts w:ascii="Montserrat" w:eastAsia="Times New Roman" w:hAnsi="Montserrat" w:cs="Calibri"/>
+          <w:kern w:val="0"/>
+          <w:sz w:val="16"/>
+          <w:szCs w:val="16"/>
+          <w14:ligatures w14:val="none"/>
+        </w:rPr>
+        <w:t xml:space="preserve"> të shpenzimeve sikur shërbimet të ishin marrë në </w:t>
+      </w:r>
+      <w:r>
+        <w:rPr>
+          <w:rFonts w:ascii="Montserrat" w:eastAsia="Times New Roman" w:hAnsi="Montserrat" w:cs="Calibri"/>
+          <w:kern w:val="0"/>
+          <w:sz w:val="16"/>
+          <w:szCs w:val="16"/>
+          <w14:ligatures w14:val="none"/>
+        </w:rPr>
+        <w:t>spital privat.</w:t>
+      </w:r>
+    </w:p>
+    <w:p>
+      <w:pPr>
+        <w:spacing w:after="0" w:line="240" w:lineRule="auto"/>
+        <w:rPr>
+          <w:rFonts w:ascii="Montserrat" w:eastAsia="Times New Roman" w:hAnsi="Montserrat" w:cs="Calibri"/>
+          <w:kern w:val="0"/>
+          <w:sz w:val="16"/>
+          <w:szCs w:val="16"/>
+          <w14:ligatures w14:val="none"/>
+        </w:rPr>
+      </w:pPr>
+      <w:r>
+        <w:rPr>
+          <w:rFonts w:ascii="Montserrat" w:eastAsia="Times New Roman" w:hAnsi="Montserrat" w:cs="Calibri"/>
+          <w:kern w:val="0"/>
+          <w:sz w:val="16"/>
+          <w:szCs w:val="16"/>
+          <w14:ligatures w14:val="none"/>
+        </w:rPr>
+        <w:t>*Nëse shërbimet në kuadër të kujdesit gjatë shtatzanisë dhe lindja merren në spital publik pa pagesë, e siguruara do të dëmshpërblehet 300€</w:t>
+      </w:r>
+      <w:r>
+        <w:rPr>
+          <w:rFonts w:ascii="Montserrat" w:eastAsia="Times New Roman" w:hAnsi="Montserrat" w:cs="Calibri"/>
+          <w:kern w:val="0"/>
+          <w:sz w:val="16"/>
+          <w:szCs w:val="16"/>
+          <w14:ligatures w14:val="none"/>
+        </w:rPr>
+        <w:t>.</w:t>
+      </w:r>
+      <w:bookmarkStart w:id="1" w:name="_GoBack"/>
+      <w:bookmarkEnd w:id="1"/>
       <w:r>
         <w:rPr>
           <w:rFonts w:ascii="Montserrat" w:eastAsia="Times New Roman" w:hAnsi="Montserrat" w:cs="Calibri"/>

</xml_diff>